<commit_message>
docs(okno-msk): fix QF003 exact-title resolution in document 01
</commit_message>
<xml_diff>
--- a/extension/docs/kwork/KW001_AI_NATIVE_YANDEX_ALICE/tests/OKNO_MSK/OKNO_MSK_RESEARCH_RELEASE_CORRECTED_2026-09-05/editable/01_OKNO_MSK_CLIENT_RESEARCH_REPORT_RU_2026-09-05.docx
+++ b/extension/docs/kwork/KW001_AI_NATIVE_YANDEX_ALICE/tests/OKNO_MSK/OKNO_MSK_RESEARCH_RELEASE_CORRECTED_2026-09-05/editable/01_OKNO_MSK_CLIENT_RESEARCH_REPORT_RU_2026-09-05.docx
@@ -578,7 +578,7 @@
         <w:rPr>
           <w:rFonts w:ascii="Calibri" w:hAnsi="Calibri" w:eastAsia="Calibri"/>
         </w:rPr>
-        <w:t xml:space="preserve">. Ни одна representative phrase не совпадает буквально с 75 строками Step-09; у QF020 есть связанное, но не тождественное наблюдение</w:t>
+        <w:t xml:space="preserve">. Ни одна stored representative phrase не совпадает буквально с 75 строками Step-09; у QF020 есть связанное, но не тождественное наблюдение</w:t>
       </w:r>
       <w:r>
         <w:rPr>
@@ -597,7 +597,7 @@
         <w:rPr>
           <w:rFonts w:ascii="Calibri" w:hAnsi="Calibri" w:eastAsia="Calibri"/>
         </w:rPr>
-        <w:t xml:space="preserve">. Для</w:t>
+        <w:t xml:space="preserve">. Текущие классы доказательства:</w:t>
       </w:r>
       <w:r>
         <w:rPr>
@@ -623,7 +623,78 @@
         <w:rPr>
           <w:rFonts w:ascii="Calibri" w:hAnsi="Calibri" w:eastAsia="Calibri"/>
         </w:rPr>
-        <w:t xml:space="preserve">representative phrases сохранён отдельный более поздний точный Search-проход Stage 13; в пяти family-level карточках representative phrase не была зафиксирована.</w:t>
+        <w:t xml:space="preserve">карточек имеют сохранённую representative phrase и отдельный точный Stage-13 Search-проход;</w:t>
+      </w:r>
+      <w:r>
+        <w:rPr>
+          <w:rFonts w:ascii="Calibri" w:hAnsi="Calibri" w:eastAsia="Calibri"/>
+        </w:rPr>
+        <w:t xml:space="preserve"> </w:t>
+      </w:r>
+      <w:r>
+        <w:rPr>
+          <w:bCs/>
+          <w:rFonts w:ascii="Calibri" w:hAnsi="Calibri" w:eastAsia="Calibri"/>
+          <w:b/>
+        </w:rPr>
+        <w:t xml:space="preserve">1</w:t>
+      </w:r>
+      <w:r>
+        <w:rPr>
+          <w:rFonts w:ascii="Calibri" w:hAnsi="Calibri" w:eastAsia="Calibri"/>
+        </w:rPr>
+        <w:t xml:space="preserve"> </w:t>
+      </w:r>
+      <w:r>
+        <w:rPr>
+          <w:rFonts w:ascii="Calibri" w:hAnsi="Calibri" w:eastAsia="Calibri"/>
+        </w:rPr>
+        <w:t xml:space="preserve">карточка не имеет сохранённого</w:t>
+      </w:r>
+      <w:r>
+        <w:rPr>
+          <w:rFonts w:ascii="Calibri" w:hAnsi="Calibri" w:eastAsia="Calibri"/>
+        </w:rPr>
+        <w:t xml:space="preserve"> </w:t>
+      </w:r>
+      <w:r>
+        <w:rPr>
+          <w:rStyle w:val="VerbatimChar"/>
+          <w:rFonts w:ascii="Calibri" w:hAnsi="Calibri" w:eastAsia="Calibri"/>
+        </w:rPr>
+        <w:t xml:space="preserve">representative_query</w:t>
+      </w:r>
+      <w:r>
+        <w:rPr>
+          <w:rFonts w:ascii="Calibri" w:hAnsi="Calibri" w:eastAsia="Calibri"/>
+        </w:rPr>
+        <w:t xml:space="preserve">, но её заголовок буквально совпадает с текущей Stage-5-фразой;</w:t>
+      </w:r>
+      <w:r>
+        <w:rPr>
+          <w:rFonts w:ascii="Calibri" w:hAnsi="Calibri" w:eastAsia="Calibri"/>
+        </w:rPr>
+        <w:t xml:space="preserve"> </w:t>
+      </w:r>
+      <w:r>
+        <w:rPr>
+          <w:bCs/>
+          <w:rFonts w:ascii="Calibri" w:hAnsi="Calibri" w:eastAsia="Calibri"/>
+          <w:b/>
+        </w:rPr>
+        <w:t xml:space="preserve">4</w:t>
+      </w:r>
+      <w:r>
+        <w:rPr>
+          <w:rFonts w:ascii="Calibri" w:hAnsi="Calibri" w:eastAsia="Calibri"/>
+        </w:rPr>
+        <w:t xml:space="preserve"> </w:t>
+      </w:r>
+      <w:r>
+        <w:rPr>
+          <w:rFonts w:ascii="Calibri" w:hAnsi="Calibri" w:eastAsia="Calibri"/>
+        </w:rPr>
+        <w:t xml:space="preserve">карточки не имеют ни сохранённой representative phrase, ни буквального title-match в Stage-5. Stage-5 semantic assignment не считается Search-наблюдением.</w:t>
       </w:r>
     </w:p>
     <w:p>
@@ -1536,7 +1607,7 @@
         <w:rPr>
           <w:rFonts w:ascii="Calibri" w:hAnsi="Calibri" w:eastAsia="Calibri"/>
         </w:rPr>
-        <w:t xml:space="preserve">Обычный Search не спрятан за счётчиками. Для 16 representative phrases существует сохранённый точный Stage-13-проход; 75 Step-09-наблюдений приведены отдельно и не подменяют его. В каждой карточке сначала показана текущая Stage-5-семантика точной фразы, затем — отдельная семейная интерпретация и реальная доказательная опора.</w:t>
+        <w:t xml:space="preserve">Обычный Search не спрятан за счётчиками. Для 16 сохранённых representative phrases существует отдельный точный Stage-13-проход; ещё 1 карточка разрешается по буквальному Stage-5 title-match без подмены Search evidence; 4 карточки остаются истинно family-only. Все 75 Step-09-наблюдений приведены отдельно. В каждой карточке сначала показана текущая Stage-5-семантика точной фразы, затем — отдельная семейная интерпретация и реальная доказательная опора.</w:t>
       </w:r>
     </w:p>
     <w:bookmarkStart w:id="39" w:name="qf001--алюминиевые-окна-на-балкон"/>
@@ -1597,7 +1668,7 @@
           <w:rFonts w:ascii="Calibri" w:hAnsi="Calibri" w:eastAsia="Calibri"/>
           <w:b/>
         </w:rPr>
-        <w:t xml:space="preserve">Репрезентативная точная фраза:</w:t>
+        <w:t xml:space="preserve">Сохранённая representative phrase:</w:t>
       </w:r>
       <w:r>
         <w:rPr>
@@ -2198,7 +2269,7 @@
           <w:rFonts w:ascii="Calibri" w:hAnsi="Calibri" w:eastAsia="Calibri"/>
           <w:b/>
         </w:rPr>
-        <w:t xml:space="preserve">Репрезентативная точная фраза:</w:t>
+        <w:t xml:space="preserve">Сохранённая representative phrase:</w:t>
       </w:r>
       <w:r>
         <w:rPr>
@@ -2813,19 +2884,45 @@
           <w:rFonts w:ascii="Calibri" w:hAnsi="Calibri" w:eastAsia="Calibri"/>
           <w:b/>
         </w:rPr>
-        <w:t xml:space="preserve">Репрезентативная точная фраза:</w:t>
-      </w:r>
-      <w:r>
-        <w:rPr>
-          <w:rFonts w:ascii="Calibri" w:hAnsi="Calibri" w:eastAsia="Calibri"/>
-        </w:rPr>
-        <w:t xml:space="preserve"> </w:t>
-      </w:r>
-      <w:r>
-        <w:rPr>
-          <w:rFonts w:ascii="Calibri" w:hAnsi="Calibri" w:eastAsia="Calibri"/>
-        </w:rPr>
-        <w:t xml:space="preserve">не зафиксирована; заголовок описывает тему family-level карточки.</w:t>
+        <w:t xml:space="preserve">Исходное поле representative_query:</w:t>
+      </w:r>
+      <w:r>
+        <w:rPr>
+          <w:rFonts w:ascii="Calibri" w:hAnsi="Calibri" w:eastAsia="Calibri"/>
+        </w:rPr>
+        <w:t xml:space="preserve"> </w:t>
+      </w:r>
+      <w:r>
+        <w:rPr>
+          <w:rFonts w:ascii="Calibri" w:hAnsi="Calibri" w:eastAsia="Calibri"/>
+        </w:rPr>
+        <w:t xml:space="preserve">не было заполнено.</w:t>
+      </w:r>
+      <w:r>
+        <w:rPr>
+          <w:rFonts w:ascii="Calibri" w:hAnsi="Calibri" w:eastAsia="Calibri"/>
+        </w:rPr>
+        <w:t xml:space="preserve"> </w:t>
+      </w:r>
+      <w:r>
+        <w:rPr>
+          <w:bCs/>
+          <w:rFonts w:ascii="Calibri" w:hAnsi="Calibri" w:eastAsia="Calibri"/>
+          <w:b/>
+        </w:rPr>
+        <w:t xml:space="preserve">Разрешение по заголовку:</w:t>
+      </w:r>
+      <w:r>
+        <w:rPr>
+          <w:rFonts w:ascii="Calibri" w:hAnsi="Calibri" w:eastAsia="Calibri"/>
+        </w:rPr>
+        <w:t xml:space="preserve"> </w:t>
+      </w:r>
+      <w:r>
+        <w:rPr>
+          <w:rFonts w:ascii="Calibri" w:hAnsi="Calibri" w:eastAsia="Calibri"/>
+        </w:rPr>
+        <w:t xml:space="preserve">текст «алюминиевые окна для частного дома» буквально присутствует как точная фраза в текущей Stage-5; историческое поле QF-authority не переписывается.</w:t>
       </w:r>
       <w:r>
         <w:rPr>
@@ -2851,7 +2948,32 @@
         <w:rPr>
           <w:rFonts w:ascii="Calibri" w:hAnsi="Calibri" w:eastAsia="Calibri"/>
         </w:rPr>
-        <w:t xml:space="preserve">Репрезентативная точная фраза не была зафиксирована; exact Search и exact owner по этой карточке не заявляются.</w:t>
+        <w:t xml:space="preserve">В исходной QF-authority отдельное поле</w:t>
+      </w:r>
+      <w:r>
+        <w:rPr>
+          <w:rFonts w:ascii="Calibri" w:hAnsi="Calibri" w:eastAsia="Calibri"/>
+        </w:rPr>
+        <w:t xml:space="preserve"> </w:t>
+      </w:r>
+      <w:r>
+        <w:rPr>
+          <w:rStyle w:val="VerbatimChar"/>
+          <w:rFonts w:ascii="Calibri" w:hAnsi="Calibri" w:eastAsia="Calibri"/>
+        </w:rPr>
+        <w:t xml:space="preserve">representative_query</w:t>
+      </w:r>
+      <w:r>
+        <w:rPr>
+          <w:rFonts w:ascii="Calibri" w:hAnsi="Calibri" w:eastAsia="Calibri"/>
+        </w:rPr>
+        <w:t xml:space="preserve"> </w:t>
+      </w:r>
+      <w:r>
+        <w:rPr>
+          <w:rFonts w:ascii="Calibri" w:hAnsi="Calibri" w:eastAsia="Calibri"/>
+        </w:rPr>
+        <w:t xml:space="preserve">не было заполнено. Точного Step-09-наблюдения для текста заголовка нет. Отдельный точный Stage-13 Search-проход для него не сохранён. Это не означает, что для фразы был выполнен отдельный exact Search-проход: показанный ниже owner следует из текущей Stage-5-семантики, а не из выдуманного Search-наблюдения.</w:t>
       </w:r>
     </w:p>
     <w:p>
@@ -2877,7 +2999,230 @@
         <w:rPr>
           <w:rFonts w:ascii="Calibri" w:hAnsi="Calibri" w:eastAsia="Calibri"/>
         </w:rPr>
-        <w:t xml:space="preserve">Не применяется: в карточке нет одной зафиксированной representative phrase. Поэтому документ не назначает ей exact-query owner.</w:t>
+        <w:t xml:space="preserve">Состояние</w:t>
+      </w:r>
+      <w:r>
+        <w:rPr>
+          <w:rFonts w:ascii="Calibri" w:hAnsi="Calibri" w:eastAsia="Calibri"/>
+        </w:rPr>
+        <w:t xml:space="preserve"> </w:t>
+      </w:r>
+      <w:r>
+        <w:rPr>
+          <w:rStyle w:val="VerbatimChar"/>
+          <w:rFonts w:ascii="Calibri" w:hAnsi="Calibri" w:eastAsia="Calibri"/>
+        </w:rPr>
+        <w:t xml:space="preserve">ASSIGNED</w:t>
+      </w:r>
+      <w:r>
+        <w:rPr>
+          <w:rFonts w:ascii="Calibri" w:hAnsi="Calibri" w:eastAsia="Calibri"/>
+        </w:rPr>
+        <w:t xml:space="preserve">; неопределённость</w:t>
+      </w:r>
+      <w:r>
+        <w:rPr>
+          <w:rFonts w:ascii="Calibri" w:hAnsi="Calibri" w:eastAsia="Calibri"/>
+        </w:rPr>
+        <w:t xml:space="preserve"> </w:t>
+      </w:r>
+      <w:r>
+        <w:rPr>
+          <w:rStyle w:val="VerbatimChar"/>
+          <w:rFonts w:ascii="Calibri" w:hAnsi="Calibri" w:eastAsia="Calibri"/>
+        </w:rPr>
+        <w:t xml:space="preserve">NONE</w:t>
+      </w:r>
+      <w:r>
+        <w:rPr>
+          <w:rFonts w:ascii="Calibri" w:hAnsi="Calibri" w:eastAsia="Calibri"/>
+        </w:rPr>
+        <w:t xml:space="preserve">.</w:t>
+      </w:r>
+      <w:r>
+        <w:rPr>
+          <w:rFonts w:ascii="Calibri" w:hAnsi="Calibri" w:eastAsia="Calibri"/>
+        </w:rPr>
+        <w:br/>
+      </w:r>
+      <w:r>
+        <w:rPr>
+          <w:bCs/>
+          <w:rFonts w:ascii="Calibri" w:hAnsi="Calibri" w:eastAsia="Calibri"/>
+          <w:b/>
+        </w:rPr>
+        <w:t xml:space="preserve">Структурная единица и задача.</w:t>
+      </w:r>
+      <w:r>
+        <w:rPr>
+          <w:rFonts w:ascii="Calibri" w:hAnsi="Calibri" w:eastAsia="Calibri"/>
+        </w:rPr>
+        <w:t xml:space="preserve"> </w:t>
+      </w:r>
+      <w:r>
+        <w:rPr>
+          <w:rStyle w:val="VerbatimChar"/>
+          <w:rFonts w:ascii="Calibri" w:hAnsi="Calibri" w:eastAsia="Calibri"/>
+        </w:rPr>
+        <w:t xml:space="preserve">ALUMINIUM_WINDOWS_COMMERCIAL</w:t>
+      </w:r>
+      <w:r>
+        <w:rPr>
+          <w:rFonts w:ascii="Calibri" w:hAnsi="Calibri" w:eastAsia="Calibri"/>
+        </w:rPr>
+        <w:t xml:space="preserve"> </w:t>
+      </w:r>
+      <w:r>
+        <w:rPr>
+          <w:rFonts w:ascii="Calibri" w:hAnsi="Calibri" w:eastAsia="Calibri"/>
+        </w:rPr>
+        <w:t xml:space="preserve">— купить или заказать алюминиевые окна; намерение</w:t>
+      </w:r>
+      <w:r>
+        <w:rPr>
+          <w:rFonts w:ascii="Calibri" w:hAnsi="Calibri" w:eastAsia="Calibri"/>
+        </w:rPr>
+        <w:t xml:space="preserve"> </w:t>
+      </w:r>
+      <w:r>
+        <w:rPr>
+          <w:rStyle w:val="VerbatimChar"/>
+          <w:rFonts w:ascii="Calibri" w:hAnsi="Calibri" w:eastAsia="Calibri"/>
+        </w:rPr>
+        <w:t xml:space="preserve">COMMERCIAL</w:t>
+      </w:r>
+      <w:r>
+        <w:rPr>
+          <w:rFonts w:ascii="Calibri" w:hAnsi="Calibri" w:eastAsia="Calibri"/>
+        </w:rPr>
+        <w:t xml:space="preserve"> </w:t>
+      </w:r>
+      <w:r>
+        <w:rPr>
+          <w:rFonts w:ascii="Calibri" w:hAnsi="Calibri" w:eastAsia="Calibri"/>
+        </w:rPr>
+        <w:t xml:space="preserve">(коммерческий выбор/заказ).</w:t>
+      </w:r>
+      <w:r>
+        <w:rPr>
+          <w:rFonts w:ascii="Calibri" w:hAnsi="Calibri" w:eastAsia="Calibri"/>
+        </w:rPr>
+        <w:br/>
+      </w:r>
+      <w:r>
+        <w:rPr>
+          <w:bCs/>
+          <w:rFonts w:ascii="Calibri" w:hAnsi="Calibri" w:eastAsia="Calibri"/>
+          <w:b/>
+        </w:rPr>
+        <w:t xml:space="preserve">Exact-query owner:</w:t>
+      </w:r>
+      <w:r>
+        <w:rPr>
+          <w:rFonts w:ascii="Calibri" w:hAnsi="Calibri" w:eastAsia="Calibri"/>
+        </w:rPr>
+        <w:t xml:space="preserve"> </w:t>
+      </w:r>
+      <w:hyperlink r:id="rId35">
+        <w:r>
+          <w:rPr>
+            <w:rStyle w:val="Hyperlink"/>
+          </w:rPr>
+          <w:t xml:space="preserve">https://okno-msk.ru/alyuminievye-okna/</w:t>
+        </w:r>
+      </w:hyperlink>
+      <w:r>
+        <w:rPr>
+          <w:rFonts w:ascii="Calibri" w:hAnsi="Calibri" w:eastAsia="Calibri"/>
+        </w:rPr>
+        <w:br/>
+      </w:r>
+      <w:r>
+        <w:rPr>
+          <w:bCs/>
+          <w:rFonts w:ascii="Calibri" w:hAnsi="Calibri" w:eastAsia="Calibri"/>
+          <w:b/>
+        </w:rPr>
+        <w:t xml:space="preserve">Канонические supporting pages:</w:t>
+      </w:r>
+      <w:r>
+        <w:rPr>
+          <w:rFonts w:ascii="Calibri" w:hAnsi="Calibri" w:eastAsia="Calibri"/>
+        </w:rPr>
+        <w:t xml:space="preserve"> </w:t>
+      </w:r>
+      <w:hyperlink r:id="rId36">
+        <w:r>
+          <w:rPr>
+            <w:rStyle w:val="Hyperlink"/>
+          </w:rPr>
+          <w:t xml:space="preserve">https://okno-msk.ru/alyuminievye-okna/provedal</w:t>
+        </w:r>
+      </w:hyperlink>
+      <w:r>
+        <w:rPr>
+          <w:rFonts w:ascii="Calibri" w:hAnsi="Calibri" w:eastAsia="Calibri"/>
+        </w:rPr>
+        <w:br/>
+      </w:r>
+      <w:r>
+        <w:rPr>
+          <w:bCs/>
+          <w:rFonts w:ascii="Calibri" w:hAnsi="Calibri" w:eastAsia="Calibri"/>
+          <w:b/>
+        </w:rPr>
+        <w:t xml:space="preserve">Структурное решение:</w:t>
+      </w:r>
+      <w:r>
+        <w:rPr>
+          <w:rFonts w:ascii="Calibri" w:hAnsi="Calibri" w:eastAsia="Calibri"/>
+        </w:rPr>
+        <w:t xml:space="preserve"> </w:t>
+      </w:r>
+      <w:r>
+        <w:rPr>
+          <w:rStyle w:val="VerbatimChar"/>
+          <w:rFonts w:ascii="Calibri" w:hAnsi="Calibri" w:eastAsia="Calibri"/>
+        </w:rPr>
+        <w:t xml:space="preserve">KEEP_EXISTING_STRUCTURE</w:t>
+      </w:r>
+      <w:r>
+        <w:rPr>
+          <w:rFonts w:ascii="Calibri" w:hAnsi="Calibri" w:eastAsia="Calibri"/>
+        </w:rPr>
+        <w:t xml:space="preserve"> </w:t>
+      </w:r>
+      <w:r>
+        <w:rPr>
+          <w:rFonts w:ascii="Calibri" w:hAnsi="Calibri" w:eastAsia="Calibri"/>
+        </w:rPr>
+        <w:t xml:space="preserve">(сохранить существующую структуру).</w:t>
+      </w:r>
+      <w:r>
+        <w:rPr>
+          <w:rFonts w:ascii="Calibri" w:hAnsi="Calibri" w:eastAsia="Calibri"/>
+        </w:rPr>
+        <w:br/>
+      </w:r>
+      <w:r>
+        <w:rPr>
+          <w:bCs/>
+          <w:rFonts w:ascii="Calibri" w:hAnsi="Calibri" w:eastAsia="Calibri"/>
+          <w:b/>
+        </w:rPr>
+        <w:t xml:space="preserve">Проверка единицы.</w:t>
+      </w:r>
+      <w:r>
+        <w:rPr>
+          <w:rFonts w:ascii="Calibri" w:hAnsi="Calibri" w:eastAsia="Calibri"/>
+        </w:rPr>
+        <w:t xml:space="preserve"> </w:t>
+      </w:r>
+      <w:r>
+        <w:rPr>
+          <w:rFonts w:ascii="Calibri" w:hAnsi="Calibri" w:eastAsia="Calibri"/>
+        </w:rPr>
+        <w:t xml:space="preserve">Каноническая власть структурной единицы совпадает с exact-query owner.</w:t>
       </w:r>
     </w:p>
     <w:p>
@@ -2943,7 +3288,7 @@
         <w:rPr>
           <w:rFonts w:ascii="Calibri" w:hAnsi="Calibri" w:eastAsia="Calibri"/>
         </w:rPr>
-        <w:t xml:space="preserve">. Это только семейная интерпретация; она не создаёт владельца для отсутствующей точной фразы.</w:t>
+        <w:t xml:space="preserve">. Семейный основной URL не противоречит exact-query owner.</w:t>
       </w:r>
     </w:p>
     <w:p>
@@ -2969,7 +3314,7 @@
         <w:rPr>
           <w:rFonts w:ascii="Calibri" w:hAnsi="Calibri" w:eastAsia="Calibri"/>
         </w:rPr>
-        <w:t xml:space="preserve">В карточке нет одной репрезентативной точной фразы. Семейный вывод основан на совокупности текущих алюминиевых назначений и различии материала «алюминий» от PVC-сценария частного дома; exact owner не заявляется. Техническая трасса:</w:t>
+        <w:t xml:space="preserve">В исходной QF-authority поле representative_query не заполнено, но заголовок карточки буквально совпадает с текущей Stage-5-фразой. Поэтому exact semantic owner известен: алюминиевый коммерческий раздел. Это семантическое назначение не создаёт отсутствующее Search-наблюдение и не доказывает историческую конкуренцию. Техническая трасса:</w:t>
       </w:r>
       <w:r>
         <w:rPr>
@@ -3172,7 +3517,7 @@
           <w:rFonts w:ascii="Calibri" w:hAnsi="Calibri" w:eastAsia="Calibri"/>
           <w:b/>
         </w:rPr>
-        <w:t xml:space="preserve">Репрезентативная точная фраза:</w:t>
+        <w:t xml:space="preserve">Сохранённая representative phrase:</w:t>
       </w:r>
       <w:r>
         <w:rPr>
@@ -3773,7 +4118,7 @@
           <w:rFonts w:ascii="Calibri" w:hAnsi="Calibri" w:eastAsia="Calibri"/>
           <w:b/>
         </w:rPr>
-        <w:t xml:space="preserve">Репрезентативная точная фраза:</w:t>
+        <w:t xml:space="preserve">Сохранённая representative phrase:</w:t>
       </w:r>
       <w:r>
         <w:rPr>
@@ -4372,7 +4717,7 @@
           <w:rFonts w:ascii="Calibri" w:hAnsi="Calibri" w:eastAsia="Calibri"/>
           <w:b/>
         </w:rPr>
-        <w:t xml:space="preserve">Репрезентативная точная фраза:</w:t>
+        <w:t xml:space="preserve">Сохранённая representative phrase:</w:t>
       </w:r>
       <w:r>
         <w:rPr>
@@ -4973,7 +5318,7 @@
           <w:rFonts w:ascii="Calibri" w:hAnsi="Calibri" w:eastAsia="Calibri"/>
           <w:b/>
         </w:rPr>
-        <w:t xml:space="preserve">Репрезентативная точная фраза:</w:t>
+        <w:t xml:space="preserve">Сохранённая representative phrase:</w:t>
       </w:r>
       <w:r>
         <w:rPr>
@@ -5602,19 +5947,19 @@
           <w:rFonts w:ascii="Calibri" w:hAnsi="Calibri" w:eastAsia="Calibri"/>
           <w:b/>
         </w:rPr>
-        <w:t xml:space="preserve">Репрезентативная точная фраза:</w:t>
-      </w:r>
-      <w:r>
-        <w:rPr>
-          <w:rFonts w:ascii="Calibri" w:hAnsi="Calibri" w:eastAsia="Calibri"/>
-        </w:rPr>
-        <w:t xml:space="preserve"> </w:t>
-      </w:r>
-      <w:r>
-        <w:rPr>
-          <w:rFonts w:ascii="Calibri" w:hAnsi="Calibri" w:eastAsia="Calibri"/>
-        </w:rPr>
-        <w:t xml:space="preserve">не зафиксирована; заголовок описывает тему family-level карточки.</w:t>
+        <w:t xml:space="preserve">Исходное поле representative_query:</w:t>
+      </w:r>
+      <w:r>
+        <w:rPr>
+          <w:rFonts w:ascii="Calibri" w:hAnsi="Calibri" w:eastAsia="Calibri"/>
+        </w:rPr>
+        <w:t xml:space="preserve"> </w:t>
+      </w:r>
+      <w:r>
+        <w:rPr>
+          <w:rFonts w:ascii="Calibri" w:hAnsi="Calibri" w:eastAsia="Calibri"/>
+        </w:rPr>
+        <w:t xml:space="preserve">не было заполнено; заголовок описывает family-level тему и не имеет буквального совпадения в текущей Stage-5.</w:t>
       </w:r>
       <w:r>
         <w:rPr>
@@ -5640,7 +5985,7 @@
         <w:rPr>
           <w:rFonts w:ascii="Calibri" w:hAnsi="Calibri" w:eastAsia="Calibri"/>
         </w:rPr>
-        <w:t xml:space="preserve">Репрезентативная точная фраза не была зафиксирована; exact Search и exact owner по этой карточке не заявляются.</w:t>
+        <w:t xml:space="preserve">Репрезентативная точная фраза не была зафиксирована, и заголовок не имеет буквального совпадения в текущей Stage-5; exact Search и exact owner по этой карточке не заявляются.</w:t>
       </w:r>
     </w:p>
     <w:p>
@@ -5666,7 +6011,7 @@
         <w:rPr>
           <w:rFonts w:ascii="Calibri" w:hAnsi="Calibri" w:eastAsia="Calibri"/>
         </w:rPr>
-        <w:t xml:space="preserve">Не применяется: в карточке нет одной зафиксированной representative phrase. Поэтому документ не назначает ей exact-query owner.</w:t>
+        <w:t xml:space="preserve">Не применяется: нет ни сохранённой representative phrase, ни буквального совпадения заголовка с текущей Stage-5. Поэтому документ не назначает карточке exact-query owner.</w:t>
       </w:r>
     </w:p>
     <w:p>
@@ -5961,19 +6306,19 @@
           <w:rFonts w:ascii="Calibri" w:hAnsi="Calibri" w:eastAsia="Calibri"/>
           <w:b/>
         </w:rPr>
-        <w:t xml:space="preserve">Репрезентативная точная фраза:</w:t>
-      </w:r>
-      <w:r>
-        <w:rPr>
-          <w:rFonts w:ascii="Calibri" w:hAnsi="Calibri" w:eastAsia="Calibri"/>
-        </w:rPr>
-        <w:t xml:space="preserve"> </w:t>
-      </w:r>
-      <w:r>
-        <w:rPr>
-          <w:rFonts w:ascii="Calibri" w:hAnsi="Calibri" w:eastAsia="Calibri"/>
-        </w:rPr>
-        <w:t xml:space="preserve">не зафиксирована; заголовок описывает тему family-level карточки.</w:t>
+        <w:t xml:space="preserve">Исходное поле representative_query:</w:t>
+      </w:r>
+      <w:r>
+        <w:rPr>
+          <w:rFonts w:ascii="Calibri" w:hAnsi="Calibri" w:eastAsia="Calibri"/>
+        </w:rPr>
+        <w:t xml:space="preserve"> </w:t>
+      </w:r>
+      <w:r>
+        <w:rPr>
+          <w:rFonts w:ascii="Calibri" w:hAnsi="Calibri" w:eastAsia="Calibri"/>
+        </w:rPr>
+        <w:t xml:space="preserve">не было заполнено; заголовок описывает family-level тему и не имеет буквального совпадения в текущей Stage-5.</w:t>
       </w:r>
       <w:r>
         <w:rPr>
@@ -5999,7 +6344,7 @@
         <w:rPr>
           <w:rFonts w:ascii="Calibri" w:hAnsi="Calibri" w:eastAsia="Calibri"/>
         </w:rPr>
-        <w:t xml:space="preserve">Репрезентативная точная фраза не была зафиксирована; exact Search и exact owner по этой карточке не заявляются.</w:t>
+        <w:t xml:space="preserve">Репрезентативная точная фраза не была зафиксирована, и заголовок не имеет буквального совпадения в текущей Stage-5; exact Search и exact owner по этой карточке не заявляются.</w:t>
       </w:r>
     </w:p>
     <w:p>
@@ -6025,7 +6370,7 @@
         <w:rPr>
           <w:rFonts w:ascii="Calibri" w:hAnsi="Calibri" w:eastAsia="Calibri"/>
         </w:rPr>
-        <w:t xml:space="preserve">Не применяется: в карточке нет одной зафиксированной representative phrase. Поэтому документ не назначает ей exact-query owner.</w:t>
+        <w:t xml:space="preserve">Не применяется: нет ни сохранённой representative phrase, ни буквального совпадения заголовка с текущей Stage-5. Поэтому документ не назначает карточке exact-query owner.</w:t>
       </w:r>
     </w:p>
     <w:p>
@@ -6314,7 +6659,7 @@
           <w:rFonts w:ascii="Calibri" w:hAnsi="Calibri" w:eastAsia="Calibri"/>
           <w:b/>
         </w:rPr>
-        <w:t xml:space="preserve">Репрезентативная точная фраза:</w:t>
+        <w:t xml:space="preserve">Сохранённая representative phrase:</w:t>
       </w:r>
       <w:r>
         <w:rPr>
@@ -6913,19 +7258,19 @@
           <w:rFonts w:ascii="Calibri" w:hAnsi="Calibri" w:eastAsia="Calibri"/>
           <w:b/>
         </w:rPr>
-        <w:t xml:space="preserve">Репрезентативная точная фраза:</w:t>
-      </w:r>
-      <w:r>
-        <w:rPr>
-          <w:rFonts w:ascii="Calibri" w:hAnsi="Calibri" w:eastAsia="Calibri"/>
-        </w:rPr>
-        <w:t xml:space="preserve"> </w:t>
-      </w:r>
-      <w:r>
-        <w:rPr>
-          <w:rFonts w:ascii="Calibri" w:hAnsi="Calibri" w:eastAsia="Calibri"/>
-        </w:rPr>
-        <w:t xml:space="preserve">не зафиксирована; заголовок описывает тему family-level карточки.</w:t>
+        <w:t xml:space="preserve">Исходное поле representative_query:</w:t>
+      </w:r>
+      <w:r>
+        <w:rPr>
+          <w:rFonts w:ascii="Calibri" w:hAnsi="Calibri" w:eastAsia="Calibri"/>
+        </w:rPr>
+        <w:t xml:space="preserve"> </w:t>
+      </w:r>
+      <w:r>
+        <w:rPr>
+          <w:rFonts w:ascii="Calibri" w:hAnsi="Calibri" w:eastAsia="Calibri"/>
+        </w:rPr>
+        <w:t xml:space="preserve">не было заполнено; заголовок описывает family-level тему и не имеет буквального совпадения в текущей Stage-5.</w:t>
       </w:r>
       <w:r>
         <w:rPr>
@@ -6951,7 +7296,7 @@
         <w:rPr>
           <w:rFonts w:ascii="Calibri" w:hAnsi="Calibri" w:eastAsia="Calibri"/>
         </w:rPr>
-        <w:t xml:space="preserve">Репрезентативная точная фраза не была зафиксирована; exact Search и exact owner по этой карточке не заявляются.</w:t>
+        <w:t xml:space="preserve">Репрезентативная точная фраза не была зафиксирована, и заголовок не имеет буквального совпадения в текущей Stage-5; exact Search и exact owner по этой карточке не заявляются.</w:t>
       </w:r>
     </w:p>
     <w:p>
@@ -6977,7 +7322,7 @@
         <w:rPr>
           <w:rFonts w:ascii="Calibri" w:hAnsi="Calibri" w:eastAsia="Calibri"/>
         </w:rPr>
-        <w:t xml:space="preserve">Не применяется: в карточке нет одной зафиксированной representative phrase. Поэтому документ не назначает ей exact-query owner.</w:t>
+        <w:t xml:space="preserve">Не применяется: нет ни сохранённой representative phrase, ни буквального совпадения заголовка с текущей Stage-5. Поэтому документ не назначает карточке exact-query owner.</w:t>
       </w:r>
     </w:p>
     <w:p>
@@ -7272,7 +7617,7 @@
           <w:rFonts w:ascii="Calibri" w:hAnsi="Calibri" w:eastAsia="Calibri"/>
           <w:b/>
         </w:rPr>
-        <w:t xml:space="preserve">Репрезентативная точная фраза:</w:t>
+        <w:t xml:space="preserve">Сохранённая representative phrase:</w:t>
       </w:r>
       <w:r>
         <w:rPr>
@@ -7871,7 +8216,7 @@
           <w:rFonts w:ascii="Calibri" w:hAnsi="Calibri" w:eastAsia="Calibri"/>
           <w:b/>
         </w:rPr>
-        <w:t xml:space="preserve">Репрезентативная точная фраза:</w:t>
+        <w:t xml:space="preserve">Сохранённая representative phrase:</w:t>
       </w:r>
       <w:r>
         <w:rPr>
@@ -8486,7 +8831,7 @@
           <w:rFonts w:ascii="Calibri" w:hAnsi="Calibri" w:eastAsia="Calibri"/>
           <w:b/>
         </w:rPr>
-        <w:t xml:space="preserve">Репрезентативная точная фраза:</w:t>
+        <w:t xml:space="preserve">Сохранённая representative phrase:</w:t>
       </w:r>
       <w:r>
         <w:rPr>
@@ -9087,7 +9432,7 @@
           <w:rFonts w:ascii="Calibri" w:hAnsi="Calibri" w:eastAsia="Calibri"/>
           <w:b/>
         </w:rPr>
-        <w:t xml:space="preserve">Репрезентативная точная фраза:</w:t>
+        <w:t xml:space="preserve">Сохранённая representative phrase:</w:t>
       </w:r>
       <w:r>
         <w:rPr>
@@ -9686,7 +10031,7 @@
           <w:rFonts w:ascii="Calibri" w:hAnsi="Calibri" w:eastAsia="Calibri"/>
           <w:b/>
         </w:rPr>
-        <w:t xml:space="preserve">Репрезентативная точная фраза:</w:t>
+        <w:t xml:space="preserve">Сохранённая representative phrase:</w:t>
       </w:r>
       <w:r>
         <w:rPr>
@@ -10301,7 +10646,7 @@
           <w:rFonts w:ascii="Calibri" w:hAnsi="Calibri" w:eastAsia="Calibri"/>
           <w:b/>
         </w:rPr>
-        <w:t xml:space="preserve">Репрезентативная точная фраза:</w:t>
+        <w:t xml:space="preserve">Сохранённая representative phrase:</w:t>
       </w:r>
       <w:r>
         <w:rPr>
@@ -10916,7 +11261,7 @@
           <w:rFonts w:ascii="Calibri" w:hAnsi="Calibri" w:eastAsia="Calibri"/>
           <w:b/>
         </w:rPr>
-        <w:t xml:space="preserve">Репрезентативная точная фраза:</w:t>
+        <w:t xml:space="preserve">Сохранённая representative phrase:</w:t>
       </w:r>
       <w:r>
         <w:rPr>
@@ -11517,7 +11862,7 @@
           <w:rFonts w:ascii="Calibri" w:hAnsi="Calibri" w:eastAsia="Calibri"/>
           <w:b/>
         </w:rPr>
-        <w:t xml:space="preserve">Репрезентативная точная фраза:</w:t>
+        <w:t xml:space="preserve">Сохранённая representative phrase:</w:t>
       </w:r>
       <w:r>
         <w:rPr>
@@ -12118,7 +12463,7 @@
           <w:rFonts w:ascii="Calibri" w:hAnsi="Calibri" w:eastAsia="Calibri"/>
           <w:b/>
         </w:rPr>
-        <w:t xml:space="preserve">Репрезентативная точная фраза:</w:t>
+        <w:t xml:space="preserve">Сохранённая representative phrase:</w:t>
       </w:r>
       <w:r>
         <w:rPr>
@@ -12744,19 +13089,19 @@
           <w:rFonts w:ascii="Calibri" w:hAnsi="Calibri" w:eastAsia="Calibri"/>
           <w:b/>
         </w:rPr>
-        <w:t xml:space="preserve">Репрезентативная точная фраза:</w:t>
-      </w:r>
-      <w:r>
-        <w:rPr>
-          <w:rFonts w:ascii="Calibri" w:hAnsi="Calibri" w:eastAsia="Calibri"/>
-        </w:rPr>
-        <w:t xml:space="preserve"> </w:t>
-      </w:r>
-      <w:r>
-        <w:rPr>
-          <w:rFonts w:ascii="Calibri" w:hAnsi="Calibri" w:eastAsia="Calibri"/>
-        </w:rPr>
-        <w:t xml:space="preserve">не зафиксирована; заголовок описывает тему family-level карточки.</w:t>
+        <w:t xml:space="preserve">Исходное поле representative_query:</w:t>
+      </w:r>
+      <w:r>
+        <w:rPr>
+          <w:rFonts w:ascii="Calibri" w:hAnsi="Calibri" w:eastAsia="Calibri"/>
+        </w:rPr>
+        <w:t xml:space="preserve"> </w:t>
+      </w:r>
+      <w:r>
+        <w:rPr>
+          <w:rFonts w:ascii="Calibri" w:hAnsi="Calibri" w:eastAsia="Calibri"/>
+        </w:rPr>
+        <w:t xml:space="preserve">не было заполнено; заголовок описывает family-level тему и не имеет буквального совпадения в текущей Stage-5.</w:t>
       </w:r>
       <w:r>
         <w:rPr>
@@ -12782,7 +13127,7 @@
         <w:rPr>
           <w:rFonts w:ascii="Calibri" w:hAnsi="Calibri" w:eastAsia="Calibri"/>
         </w:rPr>
-        <w:t xml:space="preserve">Репрезентативная точная фраза не была зафиксирована; exact Search и exact owner по этой карточке не заявляются.</w:t>
+        <w:t xml:space="preserve">Репрезентативная точная фраза не была зафиксирована, и заголовок не имеет буквального совпадения в текущей Stage-5; exact Search и exact owner по этой карточке не заявляются.</w:t>
       </w:r>
     </w:p>
     <w:p>
@@ -12808,7 +13153,7 @@
         <w:rPr>
           <w:rFonts w:ascii="Calibri" w:hAnsi="Calibri" w:eastAsia="Calibri"/>
         </w:rPr>
-        <w:t xml:space="preserve">Не применяется: в карточке нет одной зафиксированной representative phrase. Поэтому документ не назначает ей exact-query owner.</w:t>
+        <w:t xml:space="preserve">Не применяется: нет ни сохранённой representative phrase, ни буквального совпадения заголовка с текущей Stage-5. Поэтому документ не назначает карточке exact-query owner.</w:t>
       </w:r>
     </w:p>
     <w:p>

</xml_diff>

<commit_message>
docs(okno-msk): rebuild document 01 for owner value and plain language
</commit_message>
<xml_diff>
--- a/extension/docs/kwork/KW001_AI_NATIVE_YANDEX_ALICE/tests/OKNO_MSK/OKNO_MSK_RESEARCH_RELEASE_CORRECTED_2026-09-05/editable/01_OKNO_MSK_CLIENT_RESEARCH_REPORT_RU_2026-09-05.docx
+++ b/extension/docs/kwork/KW001_AI_NATIVE_YANDEX_ALICE/tests/OKNO_MSK/OKNO_MSK_RESEARCH_RELEASE_CORRECTED_2026-09-05/editable/01_OKNO_MSK_CLIENT_RESEARCH_REPORT_RU_2026-09-05.docx
@@ -56,7 +56,7 @@
         <w:spacing w:after="100"/>
       </w:pPr>
       <w:r>
-        <w:t>Сайту не требуется массовое создание новых посадочных страниц. Основная структура в целом соответствует исследованным задачам. Полностью готовы семь физических изменений существующих страниц. Ещё одна работа готова только частично: безопасную нейтральную часть можно выполнить сейчас, а фактический состав монтажной услуги должен подтвердить бизнес. Девятнадцать решений являются только аналитическим назначением страниц и не требуют физической правки сайта. Четыре вопроса требуют дополнительной проверки. Пятнадцать предполагаемых внутренних ссылок нельзя внедрять, пока не установлены точное место и естественный контекст каждой ссылки.</w:t>
+        <w:t>Исследование показало, что сайт уже закрывает значительную часть изученного спроса существующими страницами. Практический результат исследования — семь конкретных улучшений существующих страниц, которые делают выбор, параметры и навигацию понятнее для пользователя.</w:t>
       </w:r>
     </w:p>
     <w:p>
@@ -64,23 +64,23 @@
         <w:spacing w:after="100"/>
       </w:pPr>
       <w:r>
-        <w:t>Обычная выдача Яндекса использовалась как основной внешний слой для понимания задачи пользователя и ожидаемого типа страницы. Поисковый помощник применялся только в восьми заранее выбранных спорных случаях. Он не дал основания создать ни одной новой страницы или перестроить архитектуру: в четырёх случаях снизил риск неверного решения, в трёх подтвердил отсутствие необходимости изменений, в одном доказательств оказалось недостаточно.</w:t>
+        <w:t>В работу можно передать семь полностью сформулированных доработок: французские окна, окна для частного дома, практический блок о вентиляции алюминиевого остекления, выбор размеров пластиковых дверей, навигацию портфолио, панорамный сценарий в разделе алюминиевых окон и обновление статьи о лучших окнах.</w:t>
       </w:r>
     </w:p>
     <w:p>
       <w:pPr>
-        <w:pStyle w:val="Heading1"/>
+        <w:spacing w:after="100"/>
       </w:pPr>
       <w:r>
-        <w:t>1. Что исследовали</w:t>
+        <w:t>Для основных групп поискового спроса определены подходящие существующие страницы и подтверждены случаи, где текущая структура уже отвечает задаче пользователя. В результате владелец получает не только список доработок, но и понятную основу для дальнейшей работы с содержанием сайта без лишнего дублирования.</w:t>
       </w:r>
     </w:p>
     <w:p>
       <w:pPr>
-        <w:pStyle w:val="ListBullet"/>
+        <w:pStyle w:val="Heading1"/>
       </w:pPr>
       <w:r>
-        <w:t>Полный исходный корпус — 2 840 поисковых фраз.</w:t>
+        <w:t>1. Что на сайте уже работает правильно</w:t>
       </w:r>
     </w:p>
     <w:p>
@@ -88,7 +88,7 @@
         <w:pStyle w:val="ListBullet"/>
       </w:pPr>
       <w:r>
-        <w:t>2 313 фраз получили итоговое назначение; для 19 нужна отдельная поисковая проверка; 174 отложены на дополнительный разбор; 334 исключены из активного спроса с сохранением причины.</w:t>
+        <w:t>Основные коммерческие темы уже имеют подходящие страницы, поэтому значительная часть работы — усиление существующего содержания, а не создание параллельных разделов.</w:t>
       </w:r>
     </w:p>
     <w:p>
@@ -96,7 +96,7 @@
         <w:pStyle w:val="ListBullet"/>
       </w:pPr>
       <w:r>
-        <w:t>Структурная модель содержит 168 пользовательских задач и подзадач.</w:t>
+        <w:t>На сайте уже есть отдельные страницы для отделки балкона, раздвижного балконного остекления, окон в деревянный дом, стеклопакетов и раздвижных окон веранды. Эти страницы позволяют отвечать на более точные запросы без дублирования широких разделов.</w:t>
       </w:r>
     </w:p>
     <w:p>
@@ -104,7 +104,7 @@
         <w:pStyle w:val="ListBullet"/>
       </w:pPr>
       <w:r>
-        <w:t>Сохранены 75 наблюдений по конкретным запросам обычной выдачи Яндекса. Каждое относится только к тому запросу, который действительно проверялся.</w:t>
+        <w:t>Для общего выбора остекления веранды подходит общая страница веранды, а безрамный и раздвижной сценарии раскрываются на специализированных страницах.</w:t>
       </w:r>
     </w:p>
     <w:p>
@@ -112,7 +112,7 @@
         <w:pStyle w:val="ListBullet"/>
       </w:pPr>
       <w:r>
-        <w:t>Отдельно разобрано 21 материальное семейство, где важно не смешивать точную формулировку, более широкую задачу и поддерживающую страницу.</w:t>
+        <w:t>Общая панорамная страница и страница панорамных окон REHAU отвечают на разные уровни выбора: широкий и брендовый.</w:t>
       </w:r>
     </w:p>
     <w:p>
@@ -120,7 +120,7 @@
         <w:pStyle w:val="ListBullet"/>
       </w:pPr>
       <w:r>
-        <w:t>Восемь спорных случаев дополнительно проверены через поискового помощника; этот слой не заменял обычную выдачу.</w:t>
+        <w:t>Страница окон для частного дома и страница для коттеджей отвечают на широкий и более узкий сценарии объекта.</w:t>
       </w:r>
     </w:p>
     <w:p>
@@ -128,135 +128,31 @@
         <w:pStyle w:val="ListBullet"/>
       </w:pPr>
       <w:r>
-        <w:t>Практическая карта содержит 34 решения: готовые изменения, аналитические назначения, повторные проверки, ожидание данных и сохранение текущего состояния.</w:t>
+        <w:t>Продуктовый блок сравнения REHAU и отдельная статья сравнения дополняют друг друга: один помогает быстро выбрать систему, другая даёт подробное объяснение.</w:t>
       </w:r>
     </w:p>
     <w:p>
       <w:pPr>
-        <w:pStyle w:val="Heading1"/>
+        <w:pStyle w:val="ListBullet"/>
       </w:pPr>
       <w:r>
-        <w:t>2. Как читать выводы</w:t>
+        <w:t>На странице пластиковых дверей уже есть цены, калькулятор и путь к замеру — их нужно сохранить при будущих доработках.</w:t>
       </w:r>
     </w:p>
     <w:p>
       <w:pPr>
-        <w:pStyle w:val="ListBullet"/>
+        <w:pStyle w:val="Heading1"/>
       </w:pPr>
       <w:r>
-        <w:t>Наблюдение по одному точному запросу нельзя автоматически переносить на всё семейство запросов.</w:t>
+        <w:t>2. Семь приоритетных улучшений существующих страниц</w:t>
       </w:r>
     </w:p>
     <w:p>
       <w:pPr>
-        <w:pStyle w:val="ListBullet"/>
+        <w:pStyle w:val="Heading2"/>
       </w:pPr>
       <w:r>
-        <w:t>Связанность двух страниц не означает доказанную каннибализацию и не разрешает объединение, удаление или перенаправление.</w:t>
-      </w:r>
-    </w:p>
-    <w:p>
-      <w:pPr>
-        <w:pStyle w:val="ListBullet"/>
-      </w:pPr>
-      <w:r>
-        <w:t>Назначение запроса существующей странице не означает, что нужно физически менять меню, навигацию, ссылки или текст.</w:t>
-      </w:r>
-    </w:p>
-    <w:p>
-      <w:pPr>
-        <w:pStyle w:val="ListBullet"/>
-      </w:pPr>
-      <w:r>
-        <w:t>Отсутствие страницы в конкретной поисковой выдаче не означает, что страницы нет на сайте.</w:t>
-      </w:r>
-    </w:p>
-    <w:p>
-      <w:pPr>
-        <w:pStyle w:val="ListBullet"/>
-      </w:pPr>
-      <w:r>
-        <w:t>Ни обычная выдача, ни поисковый помощник не доказывают прибыль, конверсию, долгосрочную стабильность позиции или исторический ущерб без дополнительных данных.</w:t>
-      </w:r>
-    </w:p>
-    <w:p>
-      <w:pPr>
-        <w:pStyle w:val="Heading1"/>
-      </w:pPr>
-      <w:r>
-        <w:t>3. Что на сайте уже правильно и что нужно сохранить</w:t>
-      </w:r>
-    </w:p>
-    <w:p>
-      <w:pPr>
-        <w:pStyle w:val="ListBullet"/>
-      </w:pPr>
-      <w:r>
-        <w:t>Для 168 структурных задач не доказана необходимость массового создания новых страниц. Новые страницы ради полноты структуры создавать не нужно.</w:t>
-      </w:r>
-    </w:p>
-    <w:p>
-      <w:pPr>
-        <w:pStyle w:val="ListBullet"/>
-      </w:pPr>
-      <w:r>
-        <w:t>Связанные страницы не следует автоматически считать конкурирующими. Для неоднозначных пар разрушительные действия запрещены до отдельного доказательства.</w:t>
-      </w:r>
-    </w:p>
-    <w:p>
-      <w:pPr>
-        <w:pStyle w:val="ListBullet"/>
-      </w:pPr>
-      <w:r>
-        <w:t>Для общего сценария остекления веранды сохраняется общая страница веранды; узкие страницы нужны только для соответствующих специализированных задач.</w:t>
-      </w:r>
-    </w:p>
-    <w:p>
-      <w:pPr>
-        <w:pStyle w:val="ListBullet"/>
-      </w:pPr>
-      <w:r>
-        <w:t>На сайте уже есть отдельные страницы для отделки балкона, раздвижного балконного остекления, окон в деревянный дом, стеклопакетов и раздвижных окон веранды. Дубли для этих задач не нужны.</w:t>
-      </w:r>
-    </w:p>
-    <w:p>
-      <w:pPr>
-        <w:pStyle w:val="ListBullet"/>
-      </w:pPr>
-      <w:r>
-        <w:t>В восьми проверках поискового помощника не подтверждено ни одного архитектурного изменения.</w:t>
-      </w:r>
-    </w:p>
-    <w:p>
-      <w:pPr>
-        <w:pStyle w:val="ListBullet"/>
-      </w:pPr>
-      <w:r>
-        <w:t>На странице пластиковых дверей уже есть цены, калькулятор и путь к замеру — эти элементы нужно сохранить.</w:t>
-      </w:r>
-    </w:p>
-    <w:p>
-      <w:pPr>
-        <w:pStyle w:val="ListBullet"/>
-      </w:pPr>
-      <w:r>
-        <w:t>Неопределённость не нужно искусственно закрывать. Если доказательств недостаточно, это нормальный итог исследования.</w:t>
-      </w:r>
-    </w:p>
-    <w:p>
-      <w:pPr>
-        <w:pStyle w:val="Heading1"/>
-      </w:pPr>
-      <w:r>
-        <w:t>4. Семь изменений, которые можно внедрять</w:t>
-      </w:r>
-    </w:p>
-    <w:p>
-      <w:pPr>
-        <w:pStyle w:val="Heading2"/>
-      </w:pPr>
-      <w:r>
-        <w:t>1. Французские окна</w:t>
+        <w:t>1. Французские окна — сделать выбор решения понятнее</w:t>
       </w:r>
     </w:p>
     <w:p>
@@ -284,10 +180,38 @@
         <w:rPr>
           <w:b/>
         </w:rPr>
-        <w:t xml:space="preserve">Что сделать: </w:t>
+        <w:t xml:space="preserve">Что обнаружено: </w:t>
       </w:r>
       <w:r>
-        <w:t>Уточнить конфигурации, замену балконного блока и понятное отличие французского решения от общего панорамного остекления.</w:t>
+        <w:t>Страница уже объясняет базовое понятие французских окон и содержит цены, но пользователю недостаточно ясно, чем французское окно отличается от общего панорамного остекления и от замены обычного балконного блока.</w:t>
+      </w:r>
+    </w:p>
+    <w:p>
+      <w:pPr>
+        <w:spacing w:after="100"/>
+      </w:pPr>
+      <w:r>
+        <w:rPr>
+          <w:b/>
+        </w:rPr>
+        <w:t xml:space="preserve">Почему это важно: </w:t>
+      </w:r>
+      <w:r>
+        <w:t>Это разные сценарии выбора. Человеку важно понять, какое решение подходит его проёму и что именно нужно обсуждать на замере. Исследование показывает, что эту задачу можно полноценно закрыть на существующей странице.</w:t>
+      </w:r>
+    </w:p>
+    <w:p>
+      <w:pPr>
+        <w:spacing w:after="100"/>
+      </w:pPr>
+      <w:r>
+        <w:rPr>
+          <w:b/>
+        </w:rPr>
+        <w:t xml:space="preserve">Что рекомендуется сделать: </w:t>
+      </w:r>
+      <w:r>
+        <w:t>Добавить короткий сравнительный блок «французское окно / замена балконного блока / панорамное остекление». Для каждого варианта объяснить суть решения, когда его выбирают и что определяется только после замера и, если требуется, согласования.</w:t>
       </w:r>
     </w:p>
     <w:p>
@@ -301,7 +225,7 @@
         <w:t xml:space="preserve">Где: </w:t>
       </w:r>
       <w:r>
-        <w:t>После вводного определения, до цен и вариантов конфигурации.</w:t>
+        <w:t>После вводного объяснения французских окон, до цен и вариантов конфигурации.</w:t>
       </w:r>
     </w:p>
     <w:p>
@@ -312,10 +236,10 @@
         <w:rPr>
           <w:b/>
         </w:rPr>
-        <w:t xml:space="preserve">Ограничение: </w:t>
+        <w:t xml:space="preserve">Что сохранить: </w:t>
       </w:r>
       <w:r>
-        <w:t>Не дублировать уже существующее базовое определение. Не обещать возможность перепланировки без замера и согласования. Сохранить существующую ценовую часть и переход к заявке.</w:t>
+        <w:t>Существующее базовое определение, ценовой блок и переход к заявке.</w:t>
       </w:r>
     </w:p>
     <w:p>
@@ -326,18 +250,32 @@
         <w:rPr>
           <w:b/>
         </w:rPr>
-        <w:t xml:space="preserve">Проверка результата: </w:t>
+        <w:t xml:space="preserve">Как должен выглядеть результат: </w:t>
       </w:r>
       <w:r>
-        <w:t>Различия понятны, базовый текст не повторён, неподтверждённых обещаний нет.</w:t>
+        <w:t>После чтения блока человек понимает разницу между тремя сценариями и знает, какие вопросы нужно уточнить на замере.</w:t>
       </w:r>
     </w:p>
     <w:p>
       <w:pPr>
+        <w:spacing w:after="100"/>
+      </w:pPr>
+      <w:r>
+        <w:rPr>
+          <w:b/>
+        </w:rPr>
+        <w:t xml:space="preserve">Как проверить: </w:t>
+      </w:r>
+      <w:r>
+        <w:t>Нет повторения существующего определения и нет обещаний перепланировки или применимости решения без замера и необходимого согласования.</w:t>
+      </w:r>
+    </w:p>
+    <w:p>
+      <w:pPr>
         <w:pStyle w:val="Heading2"/>
       </w:pPr>
       <w:r>
-        <w:t>2. Окна для частного дома</w:t>
+        <w:t>2. Окна для частного дома — объяснить размеры и роль замера</w:t>
       </w:r>
     </w:p>
     <w:p>
@@ -365,10 +303,38 @@
         <w:rPr>
           <w:b/>
         </w:rPr>
-        <w:t xml:space="preserve">Что сделать: </w:t>
+        <w:t xml:space="preserve">Что обнаружено: </w:t>
       </w:r>
       <w:r>
-        <w:t>Добавить понятную модель типовых и нетиповых проёмов и объяснить, почему окончательные размеры определяет индивидуальный замер.</w:t>
+        <w:t>Страница помогает выбрать окна для частного дома, но недостаточно ясно объясняет разницу между типовыми и нетиповыми проёмами и почему окончательные размеры определяются индивидуальным замером.</w:t>
+      </w:r>
+    </w:p>
+    <w:p>
+      <w:pPr>
+        <w:spacing w:after="100"/>
+      </w:pPr>
+      <w:r>
+        <w:rPr>
+          <w:b/>
+        </w:rPr>
+        <w:t xml:space="preserve">Почему это важно: </w:t>
+      </w:r>
+      <w:r>
+        <w:t>Пользователь может воспринимать примеры размеров как универсальный стандарт. Понятное объяснение помогает сравнивать варианты без ложного ожидания, что одна конфигурация подходит любому дому.</w:t>
+      </w:r>
+    </w:p>
+    <w:p>
+      <w:pPr>
+        <w:spacing w:after="100"/>
+      </w:pPr>
+      <w:r>
+        <w:rPr>
+          <w:b/>
+        </w:rPr>
+        <w:t xml:space="preserve">Что рекомендуется сделать: </w:t>
+      </w:r>
+      <w:r>
+        <w:t>Добавить таблицу или короткий блок «ситуация / что проверяет замерщик / что влияет на конфигурацию» и объяснить роль типовых и индивидуальных проёмов.</w:t>
       </w:r>
     </w:p>
     <w:p>
@@ -393,10 +359,10 @@
         <w:rPr>
           <w:b/>
         </w:rPr>
-        <w:t xml:space="preserve">Ограничение: </w:t>
+        <w:t xml:space="preserve">Что сохранить: </w:t>
       </w:r>
       <w:r>
-        <w:t>Не придумывать универсальные размеры. Лучше таблица «ситуация - что проверяет замерщик - что влияет на конфигурацию».</w:t>
+        <w:t>Существующий калькулятор, предложение замера и путь к заявке.</w:t>
       </w:r>
     </w:p>
     <w:p>
@@ -407,18 +373,32 @@
         <w:rPr>
           <w:b/>
         </w:rPr>
-        <w:t xml:space="preserve">Проверка результата: </w:t>
+        <w:t xml:space="preserve">Как должен выглядеть результат: </w:t>
       </w:r>
       <w:r>
-        <w:t>Есть практическое объяснение стандартности, а замер явно остаётся окончательным источником размеров.</w:t>
+        <w:t>Пользователь понимает, какие параметры влияют на конфигурацию и почему окончательные размеры фиксируются только после замера.</w:t>
       </w:r>
     </w:p>
     <w:p>
       <w:pPr>
+        <w:spacing w:after="100"/>
+      </w:pPr>
+      <w:r>
+        <w:rPr>
+          <w:b/>
+        </w:rPr>
+        <w:t xml:space="preserve">Как проверить: </w:t>
+      </w:r>
+      <w:r>
+        <w:t>В тексте нет универсальных размеров, выдаваемых за обязательный стандарт; индивидуальный замер явно остаётся источником окончательных размеров.</w:t>
+      </w:r>
+    </w:p>
+    <w:p>
+      <w:pPr>
         <w:pStyle w:val="Heading2"/>
       </w:pPr>
       <w:r>
-        <w:t>3. Алюминиевое остекление и вентиляция</w:t>
+        <w:t>3. Алюминиевое остекление — добавить практический блок о вентиляции</w:t>
       </w:r>
     </w:p>
     <w:p>
@@ -446,10 +426,38 @@
         <w:rPr>
           <w:b/>
         </w:rPr>
-        <w:t xml:space="preserve">Что сделать: </w:t>
+        <w:t xml:space="preserve">Что обнаружено: </w:t>
       </w:r>
       <w:r>
-        <w:t>Добавить практическое объяснение вентиляции, микропроветривания, клапанов, конденсата и различий между жилым и сезонным использованием.</w:t>
+        <w:t>Статья раскрывает преимущества и недостатки алюминиевого остекления, но практическая связь между типом системы, вентиляцией, конденсатом и режимом использования раскрыта недостаточно.</w:t>
+      </w:r>
+    </w:p>
+    <w:p>
+      <w:pPr>
+        <w:spacing w:after="100"/>
+      </w:pPr>
+      <w:r>
+        <w:rPr>
+          <w:b/>
+        </w:rPr>
+        <w:t xml:space="preserve">Почему это важно: </w:t>
+      </w:r>
+      <w:r>
+        <w:t>Для выбора между холодным и тёплым решением человеку важно понимать не только свойства профиля, но и то, как помещение будет проветриваться и использоваться в разные сезоны.</w:t>
+      </w:r>
+    </w:p>
+    <w:p>
+      <w:pPr>
+        <w:spacing w:after="100"/>
+      </w:pPr>
+      <w:r>
+        <w:rPr>
+          <w:b/>
+        </w:rPr>
+        <w:t xml:space="preserve">Что рекомендуется сделать: </w:t>
+      </w:r>
+      <w:r>
+        <w:t>Добавить практический блок о проветривании, микропроветривании, клапанах, конденсате и различиях между жилым и сезонным использованием.</w:t>
       </w:r>
     </w:p>
     <w:p>
@@ -474,10 +482,10 @@
         <w:rPr>
           <w:b/>
         </w:rPr>
-        <w:t xml:space="preserve">Ограничение: </w:t>
+        <w:t xml:space="preserve">Что сохранить: </w:t>
       </w:r>
       <w:r>
-        <w:t>Не обещать функцию, которой может не быть в выбранной системе. Холодный профиль не представлять как решение для постоянно отапливаемого жилого помещения.</w:t>
+        <w:t>Существующее описание преимуществ, недостатков и типов алюминиевого остекления.</w:t>
       </w:r>
     </w:p>
     <w:p>
@@ -488,18 +496,32 @@
         <w:rPr>
           <w:b/>
         </w:rPr>
-        <w:t xml:space="preserve">Проверка результата: </w:t>
+        <w:t xml:space="preserve">Как должен выглядеть результат: </w:t>
       </w:r>
       <w:r>
-        <w:t>Рекомендации связаны с типом открывания и условиями эксплуатации; нет универсальных обещаний.</w:t>
+        <w:t>Пользователь видит, как режим эксплуатации связан с выбором системы и способом проветривания.</w:t>
       </w:r>
     </w:p>
     <w:p>
       <w:pPr>
+        <w:spacing w:after="100"/>
+      </w:pPr>
+      <w:r>
+        <w:rPr>
+          <w:b/>
+        </w:rPr>
+        <w:t xml:space="preserve">Как проверить: </w:t>
+      </w:r>
+      <w:r>
+        <w:t>Текст не обещает функции, которой может не быть в выбранной системе, и не представляет холодный профиль как решение для постоянно отапливаемого жилого помещения.</w:t>
+      </w:r>
+    </w:p>
+    <w:p>
+      <w:pPr>
         <w:pStyle w:val="Heading2"/>
       </w:pPr>
       <w:r>
-        <w:t>4. Размеры и выбор пластиковых дверей</w:t>
+        <w:t>4. Пластиковые двери — объяснить, какие размеры и параметры влияют на выбор</w:t>
       </w:r>
     </w:p>
     <w:p>
@@ -527,10 +549,38 @@
         <w:rPr>
           <w:b/>
         </w:rPr>
-        <w:t xml:space="preserve">Что сделать: </w:t>
+        <w:t xml:space="preserve">Что обнаружено: </w:t>
       </w:r>
       <w:r>
-        <w:t>Добавить ориентиры по ширине и высоте как проектным параметрам, объяснить типовой и индивидуальный блок, порог, направление открывания и роль замера.</w:t>
+        <w:t>На странице уже есть цены, калькулятор и путь к замеру, но до расчёта пользователю не хватает понятного объяснения ширины, высоты, порога, направления открывания и различия между типовым и индивидуальным блоком.</w:t>
+      </w:r>
+    </w:p>
+    <w:p>
+      <w:pPr>
+        <w:spacing w:after="100"/>
+      </w:pPr>
+      <w:r>
+        <w:rPr>
+          <w:b/>
+        </w:rPr>
+        <w:t xml:space="preserve">Почему это важно: </w:t>
+      </w:r>
+      <w:r>
+        <w:t>Эти параметры влияют на конфигурацию двери. Если их не объяснить заранее, человек видит цену, но хуже понимает, от чего зависит итоговое решение и зачем нужен замер.</w:t>
+      </w:r>
+    </w:p>
+    <w:p>
+      <w:pPr>
+        <w:spacing w:after="100"/>
+      </w:pPr>
+      <w:r>
+        <w:rPr>
+          <w:b/>
+        </w:rPr>
+        <w:t xml:space="preserve">Что рекомендуется сделать: </w:t>
+      </w:r>
+      <w:r>
+        <w:t>Добавить ориентиры по основным параметрам двери и объяснить, какие из них определяются на замере.</w:t>
       </w:r>
     </w:p>
     <w:p>
@@ -544,7 +594,7 @@
         <w:t xml:space="preserve">Где: </w:t>
       </w:r>
       <w:r>
-        <w:t>После видов дверных створок, до цен.</w:t>
+        <w:t>После описания видов дверных створок, до цен.</w:t>
       </w:r>
     </w:p>
     <w:p>
@@ -555,10 +605,10 @@
         <w:rPr>
           <w:b/>
         </w:rPr>
-        <w:t xml:space="preserve">Ограничение: </w:t>
+        <w:t xml:space="preserve">Что сохранить: </w:t>
       </w:r>
       <w:r>
-        <w:t>Не публиковать неподтверждённые универсальные размеры. Указать, что итоговая конфигурация определяется после замера.</w:t>
+        <w:t>Существующие цены, калькулятор и предложение замера.</w:t>
       </w:r>
     </w:p>
     <w:p>
@@ -569,18 +619,32 @@
         <w:rPr>
           <w:b/>
         </w:rPr>
-        <w:t xml:space="preserve">Проверка результата: </w:t>
+        <w:t xml:space="preserve">Как должен выглядеть результат: </w:t>
       </w:r>
       <w:r>
-        <w:t>Пользователь понимает, что влияет на выбор двери, а ориентиры не выдаются за окончательные размеры.</w:t>
+        <w:t>Пользователь понимает, какие параметры двери нужно выбрать или измерить до окончательного расчёта.</w:t>
       </w:r>
     </w:p>
     <w:p>
       <w:pPr>
+        <w:spacing w:after="100"/>
+      </w:pPr>
+      <w:r>
+        <w:rPr>
+          <w:b/>
+        </w:rPr>
+        <w:t xml:space="preserve">Как проверить: </w:t>
+      </w:r>
+      <w:r>
+        <w:t>Ориентиры не выдаются за универсальные размеры; итоговая конфигурация по-прежнему определяется после замера.</w:t>
+      </w:r>
+    </w:p>
+    <w:p>
+      <w:pPr>
         <w:pStyle w:val="Heading2"/>
       </w:pPr>
       <w:r>
-        <w:t>5. Навигация по портфолио</w:t>
+        <w:t>5. Портфолио — сделать примеры работ удобными для выбора</w:t>
       </w:r>
     </w:p>
     <w:p>
@@ -608,10 +672,38 @@
         <w:rPr>
           <w:b/>
         </w:rPr>
-        <w:t xml:space="preserve">Что сделать: </w:t>
+        <w:t xml:space="preserve">Что обнаружено: </w:t>
       </w:r>
       <w:r>
-        <w:t>Добавить понятную навигацию по подтверждённым типам работ: балконы, веранды, панорамные и французские решения, материал и режим использования.</w:t>
+        <w:t>На странице собраны выполненные работы, но пользователю сложно быстро найти примеры, похожие на его объект и тип остекления.</w:t>
+      </w:r>
+    </w:p>
+    <w:p>
+      <w:pPr>
+        <w:spacing w:after="100"/>
+      </w:pPr>
+      <w:r>
+        <w:rPr>
+          <w:b/>
+        </w:rPr>
+        <w:t xml:space="preserve">Почему это важно: </w:t>
+      </w:r>
+      <w:r>
+        <w:t>Человек обычно ищет не все проекты подряд, а пример, близкий к своему балкону, веранде, панорамному или французскому решению. Навигация помогает быстрее найти такой пример в уже существующем портфолио.</w:t>
+      </w:r>
+    </w:p>
+    <w:p>
+      <w:pPr>
+        <w:spacing w:after="100"/>
+      </w:pPr>
+      <w:r>
+        <w:rPr>
+          <w:b/>
+        </w:rPr>
+        <w:t xml:space="preserve">Что рекомендуется сделать: </w:t>
+      </w:r>
+      <w:r>
+        <w:t>Добавить навигацию по реально представленным типам работ: балконы, веранды, панорамные и французские решения, материал и режим использования.</w:t>
       </w:r>
     </w:p>
     <w:p>
@@ -636,10 +728,10 @@
         <w:rPr>
           <w:b/>
         </w:rPr>
-        <w:t xml:space="preserve">Ограничение: </w:t>
+        <w:t xml:space="preserve">Что сохранить: </w:t>
       </w:r>
       <w:r>
-        <w:t>Создавать только категории, для которых в портфолио действительно есть подтверждённые работы.</w:t>
+        <w:t>Все существующие работы и возможность посмотреть полный список без фильтра.</w:t>
       </w:r>
     </w:p>
     <w:p>
@@ -650,18 +742,32 @@
         <w:rPr>
           <w:b/>
         </w:rPr>
-        <w:t xml:space="preserve">Проверка результата: </w:t>
+        <w:t xml:space="preserve">Как должен выглядеть результат: </w:t>
       </w:r>
       <w:r>
-        <w:t>Пользователь может выбрать категорию, увидеть подходящие работы и вернуться к полному списку.</w:t>
+        <w:t>Пользователь может выбрать подходящую категорию, увидеть релевантные примеры и вернуться к полному списку.</w:t>
       </w:r>
     </w:p>
     <w:p>
       <w:pPr>
+        <w:spacing w:after="100"/>
+      </w:pPr>
+      <w:r>
+        <w:rPr>
+          <w:b/>
+        </w:rPr>
+        <w:t xml:space="preserve">Как проверить: </w:t>
+      </w:r>
+      <w:r>
+        <w:t>Категории создаются только там, где в портфолио действительно есть соответствующие работы.</w:t>
+      </w:r>
+    </w:p>
+    <w:p>
+      <w:pPr>
         <w:pStyle w:val="Heading2"/>
       </w:pPr>
       <w:r>
-        <w:t>6. Панорамные решения из алюминия</w:t>
+        <w:t>6. Алюминиевые окна — раскрыть панорамный сценарий на существующей странице</w:t>
       </w:r>
     </w:p>
     <w:p>
@@ -689,10 +795,38 @@
         <w:rPr>
           <w:b/>
         </w:rPr>
-        <w:t xml:space="preserve">Что сделать: </w:t>
+        <w:t xml:space="preserve">Что обнаружено: </w:t>
       </w:r>
       <w:r>
-        <w:t>Расширить существующий раздел блоком о панорамном формате, тёплом и холодном сценариях, крупных проёмах и проектных ограничениях. Новую страницу не создавать.</w:t>
+        <w:t>Исследование показало спрос на панорамные алюминиевые решения, при этом основная коммерческая страница алюминиевых окон уже подходит для этой задачи.</w:t>
+      </w:r>
+    </w:p>
+    <w:p>
+      <w:pPr>
+        <w:spacing w:after="100"/>
+      </w:pPr>
+      <w:r>
+        <w:rPr>
+          <w:b/>
+        </w:rPr>
+        <w:t xml:space="preserve">Почему это важно: </w:t>
+      </w:r>
+      <w:r>
+        <w:t>Пользователю с крупным проёмом нужно понять различия тёплого и холодного сценария, возможности больших конструкций и необходимость проектной проверки. Эту информацию логично дать там же, где он уже выбирает алюминиевую систему.</w:t>
+      </w:r>
+    </w:p>
+    <w:p>
+      <w:pPr>
+        <w:spacing w:after="100"/>
+      </w:pPr>
+      <w:r>
+        <w:rPr>
+          <w:b/>
+        </w:rPr>
+        <w:t xml:space="preserve">Что рекомендуется сделать: </w:t>
+      </w:r>
+      <w:r>
+        <w:t>Добавить блок о панорамном формате, тёплом и холодном сценариях, крупных проёмах и проектных ограничениях.</w:t>
       </w:r>
     </w:p>
     <w:p>
@@ -717,10 +851,10 @@
         <w:rPr>
           <w:b/>
         </w:rPr>
-        <w:t xml:space="preserve">Ограничение: </w:t>
+        <w:t xml:space="preserve">Что сохранить: </w:t>
       </w:r>
       <w:r>
-        <w:t>Не обещать применимость без замера и проектной проверки; не смешивать тёплый и холодный сценарии.</w:t>
+        <w:t>Существующее описание алюминиевых систем, способов открывания и базовых сценариев применения.</w:t>
       </w:r>
     </w:p>
     <w:p>
@@ -731,18 +865,32 @@
         <w:rPr>
           <w:b/>
         </w:rPr>
-        <w:t xml:space="preserve">Проверка результата: </w:t>
+        <w:t xml:space="preserve">Как должен выглядеть результат: </w:t>
       </w:r>
       <w:r>
-        <w:t>Новый адрес не создаётся; выбор системы и ограничения объяснены без неподтверждённых обещаний.</w:t>
+        <w:t>Панорамный сценарий становится понятной частью выбора алюминиевых окон без дробления информации между дублирующими страницами.</w:t>
       </w:r>
     </w:p>
     <w:p>
       <w:pPr>
+        <w:spacing w:after="100"/>
+      </w:pPr>
+      <w:r>
+        <w:rPr>
+          <w:b/>
+        </w:rPr>
+        <w:t xml:space="preserve">Как проверить: </w:t>
+      </w:r>
+      <w:r>
+        <w:t>Нет обещаний применимости без замера и проектной проверки; тёплый и холодный сценарии описаны раздельно.</w:t>
+      </w:r>
+    </w:p>
+    <w:p>
+      <w:pPr>
         <w:pStyle w:val="Heading2"/>
       </w:pPr>
       <w:r>
-        <w:t>7. Актуальность статьи о лучших окнах</w:t>
+        <w:t>7. Статья о лучших окнах — обновить актуальность и критерии сравнения</w:t>
       </w:r>
     </w:p>
     <w:p>
@@ -770,10 +918,38 @@
         <w:rPr>
           <w:b/>
         </w:rPr>
-        <w:t xml:space="preserve">Что сделать: </w:t>
+        <w:t xml:space="preserve">Что обнаружено: </w:t>
       </w:r>
       <w:r>
-        <w:t>Обновить дату и методику сравнения, раскрыть критерии и различие между брендом и конкретной моделью. Архитектуру страниц не менять.</w:t>
+        <w:t>Материал помогает сравнивать варианты, но для темы «лучшие окна» особенно важны актуальная дата, понятные критерии и различие между брендом и конкретной моделью.</w:t>
+      </w:r>
+    </w:p>
+    <w:p>
+      <w:pPr>
+        <w:spacing w:after="100"/>
+      </w:pPr>
+      <w:r>
+        <w:rPr>
+          <w:b/>
+        </w:rPr>
+        <w:t xml:space="preserve">Почему это важно: </w:t>
+      </w:r>
+      <w:r>
+        <w:t>Без видимой методики сравнения читателю трудно понять, на чём основан список и насколько он актуален. Это снижает полезность статьи как руководства по выбору.</w:t>
+      </w:r>
+    </w:p>
+    <w:p>
+      <w:pPr>
+        <w:spacing w:after="100"/>
+      </w:pPr>
+      <w:r>
+        <w:rPr>
+          <w:b/>
+        </w:rPr>
+        <w:t xml:space="preserve">Что рекомендуется сделать: </w:t>
+      </w:r>
+      <w:r>
+        <w:t>Обновить дату актуальности, описать критерии сравнения и явно разделить оценку бренда и конкретной модели или системы.</w:t>
       </w:r>
     </w:p>
     <w:p>
@@ -798,10 +974,10 @@
         <w:rPr>
           <w:b/>
         </w:rPr>
-        <w:t xml:space="preserve">Ограничение: </w:t>
+        <w:t xml:space="preserve">Что сохранить: </w:t>
       </w:r>
       <w:r>
-        <w:t>Не использовать формулировку «в этом году» рядом с устаревшей датой. Рекламное мнение не выдавать за независимый рейтинг.</w:t>
+        <w:t>Полезные существующие сравнения и объяснения, которые остаются актуальными.</w:t>
       </w:r>
     </w:p>
     <w:p>
@@ -812,26 +988,48 @@
         <w:rPr>
           <w:b/>
         </w:rPr>
-        <w:t xml:space="preserve">Проверка результата: </w:t>
+        <w:t xml:space="preserve">Как должен выглядеть результат: </w:t>
       </w:r>
       <w:r>
-        <w:t>Дата актуальности и критерии видимы; читателю понятно, как сформирован список и что именно сравнивается.</w:t>
+        <w:t>Читателю понятно, когда материал обновлялся, что именно сравнивается и по каким критериям.</w:t>
       </w:r>
     </w:p>
     <w:p>
       <w:pPr>
-        <w:pStyle w:val="Heading1"/>
+        <w:spacing w:after="100"/>
       </w:pPr>
       <w:r>
-        <w:t>5. Одна частично готовая работа</w:t>
+        <w:rPr>
+          <w:b/>
+        </w:rPr>
+        <w:t xml:space="preserve">Как проверить: </w:t>
+      </w:r>
+      <w:r>
+        <w:t>Формулировки о текущем годе согласованы с датой; рекламное мнение не выдаётся за независимый рейтинг без подтверждения.</w:t>
       </w:r>
     </w:p>
     <w:p>
       <w:pPr>
+        <w:pStyle w:val="Heading1"/>
+      </w:pPr>
+      <w:r>
+        <w:t>3. Что уточнить у компании для двух следующих улучшений</w:t>
+      </w:r>
+    </w:p>
+    <w:p>
+      <w:pPr>
+        <w:spacing w:after="100"/>
+      </w:pPr>
+      <w:r>
+        <w:t>Для двух следующих улучшений достаточно получить от компании конкретные факты об услуге и ассортименте. После подтверждения их можно оформить так же точно, как семь рекомендаций из раздела 2.</w:t>
+      </w:r>
+    </w:p>
+    <w:p>
+      <w:pPr>
         <w:pStyle w:val="Heading2"/>
       </w:pPr>
       <w:r>
-        <w:t>Монтаж пластиковых дверей</w:t>
+        <w:t>1. Состав услуги по монтажу пластиковых дверей</w:t>
       </w:r>
     </w:p>
     <w:p>
@@ -859,10 +1057,10 @@
         <w:rPr>
           <w:b/>
         </w:rPr>
-        <w:t xml:space="preserve">Что можно сделать сейчас: </w:t>
+        <w:t xml:space="preserve">Что показало исследование: </w:t>
       </w:r>
       <w:r>
-        <w:t>Сохранить существующие цены, калькулятор и путь к замеру. Можно добавить только нейтральное объяснение: профессиональный монтаж является отдельным этапом, а точный состав работ определяется после замера.</w:t>
+        <w:t>Исследование показало, что пользователю важно понимать, что именно входит в монтаж. На странице уже есть цены, калькулятор и путь к замеру, но точный состав услуги нельзя достоверно описать без данных компании.</w:t>
       </w:r>
     </w:p>
     <w:p>
@@ -873,10 +1071,10 @@
         <w:rPr>
           <w:b/>
         </w:rPr>
-        <w:t xml:space="preserve">Где: </w:t>
+        <w:t xml:space="preserve">Что нужно подтвердить: </w:t>
       </w:r>
       <w:r>
-        <w:t>Короткий поясняющий блок после цен и калькулятора либо перед формой бесплатного замера.</w:t>
+        <w:t>Подтвердить, входят ли демонтаж, вывоз, откосы, отделка, герметизация, регулировка, какие работы должен подготовить клиент и какие гарантийные границы действуют.</w:t>
       </w:r>
     </w:p>
     <w:p>
@@ -887,40 +1085,18 @@
         <w:rPr>
           <w:b/>
         </w:rPr>
-        <w:t xml:space="preserve">Что пока нельзя публиковать: </w:t>
+        <w:t xml:space="preserve">Что будет сделано после подтверждения: </w:t>
       </w:r>
       <w:r>
-        <w:t>До подтверждения компанией нельзя публиковать как факт, какие операции входят и не входят, что должен подготовить клиент, входят ли демонтаж, вывоз, откосы, отделка, герметизация, регулировка и какие точные гарантийные границы действуют.</w:t>
+        <w:t>После подтверждения можно подготовить точный клиентский блок о составе монтажа и разместить его рядом с ценами и калькулятором.</w:t>
       </w:r>
     </w:p>
     <w:p>
       <w:pPr>
-        <w:spacing w:after="100"/>
+        <w:pStyle w:val="Heading2"/>
       </w:pPr>
       <w:r>
-        <w:rPr>
-          <w:b/>
-        </w:rPr>
-        <w:t xml:space="preserve">Проверка результата: </w:t>
-      </w:r>
-      <w:r>
-        <w:t>Цена и калькулятор сохранены; новый текст не обещает неподтверждённый состав работ; перечень услуги публикуется только после документированного подтверждения компании.</w:t>
-      </w:r>
-    </w:p>
-    <w:p>
-      <w:pPr>
-        <w:pStyle w:val="Heading1"/>
-      </w:pPr>
-      <w:r>
-        <w:t>6. Четыре вопроса, где изменения пока запрещены</w:t>
-      </w:r>
-    </w:p>
-    <w:p>
-      <w:pPr>
-        <w:pStyle w:val="Heading2"/>
-      </w:pPr>
-      <w:r>
-        <w:t>1. Панорамные страницы</w:t>
+        <w:t>2. Фактическая доступность брендов фурнитуры</w:t>
       </w:r>
     </w:p>
     <w:p>
@@ -928,108 +1104,9 @@
         <w:rPr>
           <w:b/>
         </w:rPr>
-        <w:t xml:space="preserve">Связанная страница: </w:t>
+        <w:t xml:space="preserve">Страница: </w:t>
       </w:r>
       <w:hyperlink r:id="rId17">
-        <w:r>
-          <w:rPr>
-            <w:color w:val="0563C1"/>
-            <w:u w:val="single"/>
-          </w:rPr>
-          <w:t>страница панорамных окон REHAU</w:t>
-        </w:r>
-      </w:hyperlink>
-    </w:p>
-    <w:p>
-      <w:pPr>
-        <w:spacing w:after="100"/>
-      </w:pPr>
-      <w:r>
-        <w:t>Сохранить общую панорамную страницу и текущую страницу панорамных окон REHAU. Не объединять, не удалять и не перенаправлять, пока отдельная проверка не докажет вред пересечения и правильный вариант консолидации.</w:t>
-      </w:r>
-    </w:p>
-    <w:p>
-      <w:pPr>
-        <w:pStyle w:val="Heading2"/>
-      </w:pPr>
-      <w:r>
-        <w:t>2. Частный дом и коттедж</w:t>
-      </w:r>
-    </w:p>
-    <w:p>
-      <w:r>
-        <w:rPr>
-          <w:b/>
-        </w:rPr>
-        <w:t xml:space="preserve">Связанная страница: </w:t>
-      </w:r>
-      <w:hyperlink r:id="rId18">
-        <w:r>
-          <w:rPr>
-            <w:color w:val="0563C1"/>
-            <w:u w:val="single"/>
-          </w:rPr>
-          <w:t>страница окон для коттеджей и загородных домов</w:t>
-        </w:r>
-      </w:hyperlink>
-    </w:p>
-    <w:p>
-      <w:pPr>
-        <w:spacing w:after="100"/>
-      </w:pPr>
-      <w:r>
-        <w:t>Сохранить основную страницу окон для частного дома и отдельную страницу для коттеджей и загородных домов. Разрушительные действия пока не обоснованы.</w:t>
-      </w:r>
-    </w:p>
-    <w:p>
-      <w:pPr>
-        <w:pStyle w:val="Heading2"/>
-      </w:pPr>
-      <w:r>
-        <w:t>3. Сравнение REHAU</w:t>
-      </w:r>
-    </w:p>
-    <w:p>
-      <w:r>
-        <w:rPr>
-          <w:b/>
-        </w:rPr>
-        <w:t xml:space="preserve">Связанная страница: </w:t>
-      </w:r>
-      <w:hyperlink r:id="rId19">
-        <w:r>
-          <w:rPr>
-            <w:color w:val="0563C1"/>
-            <w:u w:val="single"/>
-          </w:rPr>
-          <w:t>статья сравнения профилей REHAU</w:t>
-        </w:r>
-      </w:hyperlink>
-    </w:p>
-    <w:p>
-      <w:pPr>
-        <w:spacing w:after="100"/>
-      </w:pPr>
-      <w:r>
-        <w:t>Сохранить продуктовый блок сравнения и отдельную статью. До дополнительной проверки продуктовый раздел считать основным; не объединять и не удалять.</w:t>
-      </w:r>
-    </w:p>
-    <w:p>
-      <w:pPr>
-        <w:pStyle w:val="Heading2"/>
-      </w:pPr>
-      <w:r>
-        <w:t>4. Фурнитура</w:t>
-      </w:r>
-    </w:p>
-    <w:p>
-      <w:r>
-        <w:rPr>
-          <w:b/>
-        </w:rPr>
-        <w:t xml:space="preserve">Связанная страница: </w:t>
-      </w:r>
-      <w:hyperlink r:id="rId20">
         <w:r>
           <w:rPr>
             <w:color w:val="0563C1"/>
@@ -1044,15 +1121,27 @@
         <w:spacing w:after="100"/>
       </w:pPr>
       <w:r>
-        <w:t>До расширения текста подтвердить, что Accado, Vorne и Futurus действительно доступны компании. Неподтверждённые бренды не обещать.</w:t>
+        <w:rPr>
+          <w:b/>
+        </w:rPr>
+        <w:t xml:space="preserve">Что показало исследование: </w:t>
+      </w:r>
+      <w:r>
+        <w:t>В материалах встречаются Accado, Vorne и Futurus. Прежде чем расширять текст о выборе фурнитуры, нужно убедиться, что эти бренды действительно доступны в текущем предложении компании.</w:t>
       </w:r>
     </w:p>
     <w:p>
       <w:pPr>
-        <w:pStyle w:val="Heading1"/>
+        <w:spacing w:after="100"/>
       </w:pPr>
       <w:r>
-        <w:t>7. Двадцать одно спорное семейство запросов</w:t>
+        <w:rPr>
+          <w:b/>
+        </w:rPr>
+        <w:t xml:space="preserve">Что нужно подтвердить: </w:t>
+      </w:r>
+      <w:r>
+        <w:t>Подтвердить текущий ассортимент фурнитуры, который компания реально продаёт или устанавливает.</w:t>
       </w:r>
     </w:p>
     <w:p>
@@ -1060,7 +1149,29 @@
         <w:spacing w:after="100"/>
       </w:pPr>
       <w:r>
-        <w:t>Ниже показан клиентский вывод по каждому материальному семейству. Там, где точной поисковой проверки недостаточно, вывод не выдаётся за наблюдение выдачи и не становится основанием для физической правки сайта.</w:t>
+        <w:rPr>
+          <w:b/>
+        </w:rPr>
+        <w:t xml:space="preserve">Что будет сделано после подтверждения: </w:t>
+      </w:r>
+      <w:r>
+        <w:t>После подтверждения можно обновить раздел выбора фурнитуры без риска обещать отсутствующий ассортимент.</w:t>
+      </w:r>
+    </w:p>
+    <w:p>
+      <w:pPr>
+        <w:pStyle w:val="Heading1"/>
+      </w:pPr>
+      <w:r>
+        <w:t>4. Как распределены основные группы поискового спроса</w:t>
+      </w:r>
+    </w:p>
+    <w:p>
+      <w:pPr>
+        <w:spacing w:after="100"/>
+      </w:pPr>
+      <w:r>
+        <w:t>Ниже показано, какая страница лучше отвечает на каждую из 21 важных тем и почему. Карта помогает владельцу и редактору понимать роль каждой страницы при дальнейшей работе с содержанием сайта.</w:t>
       </w:r>
     </w:p>
     <w:p>
@@ -1076,7 +1187,7 @@
         <w:spacing w:after="100"/>
       </w:pPr>
       <w:r>
-        <w:t>В широком разборе балконная страница описывает объектный сценарий, но точная формулировка про алюминиевые окна относится к коммерческому разделу алюминиевых окон. Обе страницы сохраняются; объединение не доказано.</w:t>
+        <w:t>Запрос о покупке алюминиевых окон должен вести в раздел алюминиевых окон. Балконный раздел полезен для более широкого выбора решения по объекту, поэтому две страницы отвечают на разные вопросы пользователя.</w:t>
       </w:r>
     </w:p>
     <w:p>
@@ -1092,7 +1203,7 @@
         <w:spacing w:after="100"/>
       </w:pPr>
       <w:r>
-        <w:t>Явное холодное или раздвижное балконное намерение относится к специализированной странице холодного остекления.</w:t>
+        <w:t>Запросы с явным холодным или раздвижным сценарием должны вести на специализированную страницу холодного остекления.</w:t>
       </w:r>
     </w:p>
     <w:p>
@@ -1108,7 +1219,7 @@
         <w:spacing w:after="100"/>
       </w:pPr>
       <w:r>
-        <w:t>Задача остаётся у раздела алюминиевых окон; историческая конкуренция с другими страницами не доказана. Для этой формулировки вывод о странице следует из итоговой семантической модели, а не из отдельного наблюдения выдачи.</w:t>
+        <w:t>Когда пользователь выбирает именно алюминиевые окна для дома, основной ответ должен давать раздел алюминиевых окон; страница частного дома остаётся более широким контекстом по объекту.</w:t>
       </w:r>
     </w:p>
     <w:p>
@@ -1124,7 +1235,7 @@
         <w:spacing w:after="100"/>
       </w:pPr>
       <w:r>
-        <w:t>Коммерческая задача остаётся у раздела алюминиевых окон; панорамный материал нужен как поддерживающее объяснение, но не как новая отдельная страница.</w:t>
+        <w:t>Панорамный алюминиевый сценарий лучше раскрывать в разделе алюминиевых окон отдельным содержательным блоком, потому что пользователь выбирает прежде всего материал и конструкцию.</w:t>
       </w:r>
     </w:p>
     <w:p>
@@ -1140,7 +1251,7 @@
         <w:spacing w:after="100"/>
       </w:pPr>
       <w:r>
-        <w:t>Семейный разбор различает алюминиевый продукт и общую услугу монтажа; точная установочная задача относится к странице профессионального монтажа.</w:t>
+        <w:t>Запрос об установке относится к профессиональному монтажу; раздел алюминиевых окон остаётся местом выбора самого изделия.</w:t>
       </w:r>
     </w:p>
     <w:p>
@@ -1156,7 +1267,7 @@
         <w:spacing w:after="100"/>
       </w:pPr>
       <w:r>
-        <w:t>Общий объектный сценарий веранды сохраняется за общей страницей веранды, но коммерческий выбор алюминиевых окон относится к разделу алюминиевых окон.</w:t>
+        <w:t>При выборе алюминиевых окон основной ответ даёт раздел алюминиевых окон, а общая страница веранды помогает пользователю выбрать решение для объекта в целом.</w:t>
       </w:r>
     </w:p>
     <w:p>
@@ -1172,7 +1283,7 @@
         <w:spacing w:after="100"/>
       </w:pPr>
       <w:r>
-        <w:t>Специализированная страница панорамного остекления балкона остаётся основной; менять архитектуру оснований нет.</w:t>
+        <w:t>Для явного панорамного остекления балкона основным ответом остаётся специализированная балконная страница.</w:t>
       </w:r>
     </w:p>
     <w:p>
@@ -1188,7 +1299,7 @@
         <w:spacing w:after="100"/>
       </w:pPr>
       <w:r>
-        <w:t>Покупка пластиковой двери и общая услуга монтажа имеют разные роли. Вред пересечения не доказан, поэтому страницы сохраняются.</w:t>
+        <w:t>Покупка двери и её монтаж — разные вопросы. Страница дверей отвечает за выбор изделия, а монтажная страница — за установку.</w:t>
       </w:r>
     </w:p>
     <w:p>
@@ -1204,7 +1315,7 @@
         <w:spacing w:after="100"/>
       </w:pPr>
       <w:r>
-        <w:t>Отдельное точное семейство в исходном корпусе не сформировано. Существующие страницы балконных и раздвижных дверей сохраняются; нового владельца не придумывать.</w:t>
+        <w:t>Формулировки этой темы лучше распределять между существующими страницами балконных и раздвижных дверей в зависимости от того, что именно ищет пользователь.</w:t>
       </w:r>
     </w:p>
     <w:p>
@@ -1220,7 +1331,7 @@
         <w:spacing w:after="100"/>
       </w:pPr>
       <w:r>
-        <w:t>Точная установочная задача относится к профессиональной отделочной услуге; товарная страница подоконника остаётся поддержкой.</w:t>
+        <w:t>Запрос об установке подоконника относится к профессиональной отделочной услуге; товарная страница подоконника помогает выбрать само изделие.</w:t>
       </w:r>
     </w:p>
     <w:p>
@@ -1236,7 +1347,7 @@
         <w:spacing w:after="100"/>
       </w:pPr>
       <w:r>
-        <w:t>Декоративные раскладки и шпросы относятся к аксессуарной задаче; страница французских окон даёт контекст, но не заменяет её.</w:t>
+        <w:t>Шпросы и декоративные раскладки относятся к аксессуарам, а страница французских окон даёт контекст применения такого оформления.</w:t>
       </w:r>
     </w:p>
     <w:p>
@@ -1252,7 +1363,7 @@
         <w:spacing w:after="100"/>
       </w:pPr>
       <w:r>
-        <w:t>Ремонт ручки относится к ремонтной услуге, а покупка ручки - к товарной странице. Эти задачи нельзя смешивать.</w:t>
+        <w:t>Если пользователь хочет починить ручку, ему нужна ремонтная услуга; если хочет купить ручку, ему нужна товарная страница фурнитуры.</w:t>
       </w:r>
     </w:p>
     <w:p>
@@ -1268,7 +1379,7 @@
         <w:spacing w:after="100"/>
       </w:pPr>
       <w:r>
-        <w:t>Французская страница сохраняет отдельную терминологическую и конфигурационную роль, а общая панорамная страница отвечает за более широкий коммерческий сценарий.</w:t>
+        <w:t>Страница французских окон отвечает за специальную конфигурацию и терминологию, а общая панорамная страница — за более широкий выбор панорамного решения.</w:t>
       </w:r>
     </w:p>
     <w:p>
@@ -1284,7 +1395,7 @@
         <w:spacing w:after="100"/>
       </w:pPr>
       <w:r>
-        <w:t>Французская страница остаётся точной для специальной конфигурации внутри более широкой задачи остекления частного дома.</w:t>
+        <w:t>При явном запросе французской конфигурации основной ответ должна давать страница французских окон, а раздел частного дома остаётся более широким контекстом.</w:t>
       </w:r>
     </w:p>
     <w:p>
@@ -1300,7 +1411,7 @@
         <w:spacing w:after="100"/>
       </w:pPr>
       <w:r>
-        <w:t>Французская страница сохраняет продуктовую роль, а точная установочная задача относится к общей странице профессионального монтажа.</w:t>
+        <w:t>Страница французских окон отвечает за выбор решения, а запрос об установке должен вести к профессиональному монтажу.</w:t>
       </w:r>
     </w:p>
     <w:p>
@@ -1316,7 +1427,7 @@
         <w:spacing w:after="100"/>
       </w:pPr>
       <w:r>
-        <w:t>Отдельная панорамная страница домов обнаружена, но сама по себе её наличность не является основанием автоматически менять принятое назначение общей страницы окон для частного дома.</w:t>
+        <w:t>Для широкого выбора окон в частный дом основным остаётся раздел частного дома; специализированная панорамная страница нужна, когда пользователь явно выбирает панорамное решение.</w:t>
       </w:r>
     </w:p>
     <w:p>
@@ -1332,7 +1443,7 @@
         <w:spacing w:after="100"/>
       </w:pPr>
       <w:r>
-        <w:t>Отдельная страница панорамных окон на террасу существует, но её наличие само по себе не разрешает переназначение общей задачи веранды и террасы.</w:t>
+        <w:t>Общая страница веранды и террасы отвечает на широкий выбор остекления объекта, а специализированная панорамная страница — на явный панорамный сценарий.</w:t>
       </w:r>
     </w:p>
     <w:p>
@@ -1348,7 +1459,7 @@
         <w:spacing w:after="100"/>
       </w:pPr>
       <w:r>
-        <w:t>Замена окна остаётся на специализированной странице замены; общая страница монтажа поддерживает объяснение процесса.</w:t>
+        <w:t>Запрос о замене окна должен вести на специализированную страницу замены; страница монтажа дополняет её объяснением процесса установки.</w:t>
       </w:r>
     </w:p>
     <w:p>
@@ -1364,7 +1475,7 @@
         <w:spacing w:after="100"/>
       </w:pPr>
       <w:r>
-        <w:t>Формулировка двусмысленна. Узкую аварийную инструкцию нельзя расширять до общей инструкции без нового доказательства.</w:t>
+        <w:t>Формулировка может означать обычное использование или аварийную ситуацию. Узкая инструкция подходит только для явно аварийного сценария, а общий вопрос требует более широкого объяснения.</w:t>
       </w:r>
     </w:p>
     <w:p>
@@ -1380,7 +1491,7 @@
         <w:spacing w:after="100"/>
       </w:pPr>
       <w:r>
-        <w:t>Статья о лучших окнах и широкое руководство по выбору имеют разные роли. Обновление методики рейтинга допустимо, а перестройка архитектуры не доказана.</w:t>
+        <w:t>Статья о лучших окнах нужна для сравнения вариантов, а общее руководство по выбору — для более широкого процесса выбора. Эти материалы выполняют разные задачи.</w:t>
       </w:r>
     </w:p>
     <w:p>
@@ -1396,7 +1507,7 @@
         <w:spacing w:after="100"/>
       </w:pPr>
       <w:r>
-        <w:t>Панорамный информационный материал отвечает за специальный выбор; общее руководство по пластиковым окнам остаётся поддержкой.</w:t>
+        <w:t>Материал о панорамных окнах помогает сравнить специальный сценарий, а общее руководство по пластиковым окнам даёт базовые критерии выбора.</w:t>
       </w:r>
     </w:p>
     <w:p>
@@ -1404,7 +1515,7 @@
         <w:pStyle w:val="Heading1"/>
       </w:pPr>
       <w:r>
-        <w:t>8. Восемь проверок поискового помощника</w:t>
+        <w:t>5. Дополнительная проверка восьми важных тем</w:t>
       </w:r>
     </w:p>
     <w:p>
@@ -1412,15 +1523,23 @@
         <w:spacing w:after="100"/>
       </w:pPr>
       <w:r>
-        <w:t>Эти проверки были дополнительным слоем. Проверялся отдельный поисковый режим Яндекса, а не пользовательская Алиса. Результаты использовались только для проверки уже сформулированных спорных решений, не переносились на поведение Алисы и не создавали архитектуру сайта самостоятельно.</w:t>
+        <w:t>Для восьми важных тем выводы дополнительно сверили с автоматическими ответами в поиске Яндекса. Эта сверка использовалась, чтобы проверить выбор страниц и содержание рекомендаций; прогноз позиций, трафика или будущего поведения пользователей в неё не входил.</w:t>
       </w:r>
     </w:p>
     <w:p>
       <w:pPr>
+        <w:spacing w:after="100"/>
+      </w:pPr>
+      <w:r>
+        <w:t>Это были автоматические ответы в поисковой выдаче Яндекса, а не отдельные ответы Алисы.</w:t>
+      </w:r>
+    </w:p>
+    <w:p>
+      <w:pPr>
         <w:pStyle w:val="Heading2"/>
       </w:pPr>
       <w:r>
-        <w:t>1. Запрос: «Панорамные алюминиевые окна»</w:t>
+        <w:t>1. «Панорамные алюминиевые окна»</w:t>
       </w:r>
     </w:p>
     <w:p>
@@ -1431,18 +1550,18 @@
         <w:rPr>
           <w:b/>
         </w:rPr>
-        <w:t xml:space="preserve">Итог: </w:t>
+        <w:t xml:space="preserve">Что добавила проверка: </w:t>
       </w:r>
       <w:r>
-        <w:t>Снижен риск ошибочного решения.</w:t>
+        <w:t>Дополнительная проверка подтвердила, что панорамный сценарий логично раскрывать в существующем разделе алюминиевых окон. Рекомендация — усилить эту страницу объяснением панорамного формата, тёплого и холодного сценария и проектных ограничений.</w:t>
       </w:r>
     </w:p>
     <w:p>
       <w:pPr>
-        <w:spacing w:after="100"/>
+        <w:pStyle w:val="Heading2"/>
       </w:pPr>
       <w:r>
-        <w:t>Коммерческий раздел алюминиевых окон остаётся основным. Допустимо усилить существующую страницу объяснением панорамного формата, тёплого и холодного сценария и проектных ограничений. Новая страница не нужна.</w:t>
+        <w:t>2. «Алюминиевые окна для веранды»</w:t>
       </w:r>
     </w:p>
     <w:p>
@@ -1453,10 +1572,10 @@
         <w:rPr>
           <w:b/>
         </w:rPr>
-        <w:t xml:space="preserve">Ограничение: </w:t>
+        <w:t xml:space="preserve">Что добавила проверка: </w:t>
       </w:r>
       <w:r>
-        <w:t>вывод относится к этому проверенному случаю и не доказывает долгосрочную стабильность выдачи, приоритет источников, трафик или конверсию.</w:t>
+        <w:t>Дополнительная проверка подтвердила текущую логику: общий выбор решения для веранды раскрывается на странице веранды, а выбор алюминиевых окон — в разделе алюминиевых окон.</w:t>
       </w:r>
     </w:p>
     <w:p>
@@ -1464,7 +1583,7 @@
         <w:pStyle w:val="Heading2"/>
       </w:pPr>
       <w:r>
-        <w:t>2. Запрос: «Алюминиевые окна для веранды»</w:t>
+        <w:t>3. «Панорамное остекление балкона»</w:t>
       </w:r>
     </w:p>
     <w:p>
@@ -1475,18 +1594,18 @@
         <w:rPr>
           <w:b/>
         </w:rPr>
-        <w:t xml:space="preserve">Итог: </w:t>
+        <w:t xml:space="preserve">Что добавила проверка: </w:t>
       </w:r>
       <w:r>
-        <w:t>Снижен риск ошибочного решения.</w:t>
+        <w:t>Дополнительная проверка подтвердила специализированную балконную страницу как подходящий ответ на явный панорамный сценарий.</w:t>
       </w:r>
     </w:p>
     <w:p>
       <w:pPr>
-        <w:spacing w:after="100"/>
+        <w:pStyle w:val="Heading2"/>
       </w:pPr>
       <w:r>
-        <w:t>Общий сценарий веранды сохраняется. Ответ помощника не дал оснований создавать новое действие или менять основную страницу.</w:t>
+        <w:t>4. «Установка подоконника на пластиковые окна»</w:t>
       </w:r>
     </w:p>
     <w:p>
@@ -1497,10 +1616,10 @@
         <w:rPr>
           <w:b/>
         </w:rPr>
-        <w:t xml:space="preserve">Ограничение: </w:t>
+        <w:t xml:space="preserve">Что добавила проверка: </w:t>
       </w:r>
       <w:r>
-        <w:t>вывод относится к этому проверенному случаю и не доказывает долгосрочную стабильность выдачи, приоритет источников, трафик или конверсию.</w:t>
+        <w:t>Дополнительная проверка подтвердила профессиональную монтажную и отделочную страницу как правильный ответ на запрос об установке; товарная страница подоконника остаётся местом выбора самого изделия.</w:t>
       </w:r>
     </w:p>
     <w:p>
@@ -1508,7 +1627,7 @@
         <w:pStyle w:val="Heading2"/>
       </w:pPr>
       <w:r>
-        <w:t>3. Запрос: «Панорамное остекление балкона»</w:t>
+        <w:t>5. «Французские панорамные окна»</w:t>
       </w:r>
     </w:p>
     <w:p>
@@ -1519,18 +1638,18 @@
         <w:rPr>
           <w:b/>
         </w:rPr>
-        <w:t xml:space="preserve">Итог: </w:t>
+        <w:t xml:space="preserve">Что добавила проверка: </w:t>
       </w:r>
       <w:r>
-        <w:t>Снижен риск ошибочного решения.</w:t>
+        <w:t>Дополнительная проверка подтвердила самостоятельную роль французского решения и поддержала рекомендацию яснее сравнить его с общим панорамным остеклением на существующей странице.</w:t>
       </w:r>
     </w:p>
     <w:p>
       <w:pPr>
-        <w:spacing w:after="100"/>
+        <w:pStyle w:val="Heading2"/>
       </w:pPr>
       <w:r>
-        <w:t>Специализированная балконная страница подтверждается; содержательный пробел, требующий отдельной работы, не доказан.</w:t>
+        <w:t>6. «Замена окна на пластиковое, цена в Москве»</w:t>
       </w:r>
     </w:p>
     <w:p>
@@ -1541,10 +1660,10 @@
         <w:rPr>
           <w:b/>
         </w:rPr>
-        <w:t xml:space="preserve">Ограничение: </w:t>
+        <w:t xml:space="preserve">Что добавила проверка: </w:t>
       </w:r>
       <w:r>
-        <w:t>вывод относится к этому проверенному случаю и не доказывает долгосрочную стабильность выдачи, приоритет источников, трафик или конверсию.</w:t>
+        <w:t>Дополнительная проверка подтвердила специализированную страницу замены как основной ответ на эту задачу.</w:t>
       </w:r>
     </w:p>
     <w:p>
@@ -1552,7 +1671,7 @@
         <w:pStyle w:val="Heading2"/>
       </w:pPr>
       <w:r>
-        <w:t>4. Запрос: «Установка подоконника на пластиковые окна»</w:t>
+        <w:t>7. «Как открыть пластиковое окно»</w:t>
       </w:r>
     </w:p>
     <w:p>
@@ -1563,18 +1682,18 @@
         <w:rPr>
           <w:b/>
         </w:rPr>
-        <w:t xml:space="preserve">Итог: </w:t>
+        <w:t xml:space="preserve">Что добавила проверка: </w:t>
       </w:r>
       <w:r>
-        <w:t>Изменения не требуются.</w:t>
+        <w:t>Дополнительная проверка подтвердила, что запрос может означать обычное использование или аварийную ситуацию. Поэтому общий материал должен различать эти два сценария и направлять пользователя к подходящему объяснению.</w:t>
       </w:r>
     </w:p>
     <w:p>
       <w:pPr>
-        <w:spacing w:after="100"/>
+        <w:pStyle w:val="Heading2"/>
       </w:pPr>
       <w:r>
-        <w:t>Процедурная форма ответа совместима с уже принятой страницей. Расширять страницу только из-за ответа помощника не нужно.</w:t>
+        <w:t>8. «Лучшие пластиковые окна»</w:t>
       </w:r>
     </w:p>
     <w:p>
@@ -1585,202 +1704,194 @@
         <w:rPr>
           <w:b/>
         </w:rPr>
-        <w:t xml:space="preserve">Ограничение: </w:t>
+        <w:t xml:space="preserve">Что добавила проверка: </w:t>
       </w:r>
       <w:r>
-        <w:t>вывод относится к этому проверенному случаю и не доказывает долгосрочную стабильность выдачи, приоритет источников, трафик или конверсию.</w:t>
+        <w:t>Дополнительная проверка поддержала практический вывод: для статьи важнее всего актуальная дата, понятные критерии и прозрачная методика сравнения.</w:t>
       </w:r>
     </w:p>
     <w:p>
       <w:pPr>
-        <w:pStyle w:val="Heading2"/>
+        <w:pStyle w:val="Heading1"/>
       </w:pPr>
       <w:r>
-        <w:t>5. Запрос: «Французские панорамные окна»</w:t>
+        <w:t>6. Что передать в работу в первую очередь</w:t>
       </w:r>
     </w:p>
     <w:p>
       <w:pPr>
-        <w:spacing w:after="100"/>
+        <w:pStyle w:val="ListBullet"/>
       </w:pPr>
       <w:r>
-        <w:rPr>
-          <w:b/>
-        </w:rPr>
-        <w:t xml:space="preserve">Итог: </w:t>
-      </w:r>
-      <w:r>
-        <w:t>Снижен риск ошибочного решения.</w:t>
+        <w:t>Передать редактору или разработчику семь рекомендаций из раздела 2 вместе с указанными причинами и критериями проверки.</w:t>
       </w:r>
     </w:p>
     <w:p>
       <w:pPr>
-        <w:spacing w:after="100"/>
+        <w:pStyle w:val="ListBullet"/>
       </w:pPr>
       <w:r>
-        <w:t>Самостоятельная роль французского решения сохраняется. На существующей странице полезно яснее объяснить отличие от общего панорамного остекления.</w:t>
+        <w:t>Получить у компании подтверждение состава монтажа пластиковых дверей и фактического ассортимента фурнитуры; после этого завершить две соответствующие доработки текста.</w:t>
       </w:r>
     </w:p>
     <w:p>
       <w:pPr>
-        <w:spacing w:after="100"/>
+        <w:pStyle w:val="ListBullet"/>
       </w:pPr>
       <w:r>
-        <w:rPr>
-          <w:b/>
-        </w:rPr>
-        <w:t xml:space="preserve">Ограничение: </w:t>
-      </w:r>
-      <w:r>
-        <w:t>вывод относится к этому проверенному случаю и не доказывает долгосрочную стабильность выдачи, приоритет источников, трафик или конверсию.</w:t>
+        <w:t>При обновлении страниц использовать карту спроса из раздела 4, чтобы каждая страница отвечала на свою пользовательскую задачу и не дублировала соседние страницы.</w:t>
       </w:r>
     </w:p>
     <w:p>
       <w:pPr>
-        <w:pStyle w:val="Heading2"/>
+        <w:pStyle w:val="ListBullet"/>
       </w:pPr>
       <w:r>
-        <w:t>6. Запрос: «Замена окна на пластиковое, цена в Москве»</w:t>
+        <w:t>После внедрения проверить каждую из семи доработок по критериям из её карточки.</w:t>
       </w:r>
     </w:p>
     <w:p>
       <w:pPr>
-        <w:spacing w:after="100"/>
+        <w:pStyle w:val="Heading1"/>
       </w:pPr>
       <w:r>
-        <w:rPr>
-          <w:b/>
-        </w:rPr>
-        <w:t xml:space="preserve">Итог: </w:t>
-      </w:r>
-      <w:r>
-        <w:t>Изменения не требуются.</w:t>
+        <w:t>7. Что было проверено</w:t>
       </w:r>
     </w:p>
     <w:p>
       <w:pPr>
-        <w:spacing w:after="100"/>
+        <w:pStyle w:val="ListBullet"/>
       </w:pPr>
       <w:r>
-        <w:t>Специализированная страница замены сохраняется. Содержательный пробел по использованным источникам не доказан.</w:t>
+        <w:t>Проанализированы 2 840 поисковых фраз.</w:t>
       </w:r>
     </w:p>
     <w:p>
       <w:pPr>
-        <w:spacing w:after="100"/>
+        <w:pStyle w:val="ListBullet"/>
       </w:pPr>
       <w:r>
-        <w:rPr>
-          <w:b/>
-        </w:rPr>
-        <w:t xml:space="preserve">Ограничение: </w:t>
-      </w:r>
-      <w:r>
-        <w:t>вывод относится к этому проверенному случаю и не доказывает долгосрочную стабильность выдачи, приоритет источников, трафик или конверсию.</w:t>
+        <w:t>Для 2 313 запросов определено, какая существующая страница лучше отвечает на задачу пользователя; редкие и неоднозначные формулировки сохранены отдельно для возможной дополнительной проверки.</w:t>
       </w:r>
     </w:p>
     <w:p>
       <w:pPr>
-        <w:pStyle w:val="Heading2"/>
+        <w:pStyle w:val="ListBullet"/>
       </w:pPr>
       <w:r>
-        <w:t>7. Запрос: «Как открыть пластиковое окно»</w:t>
+        <w:t>Спрос сгруппирован в 168 пользовательских задач и подзадач.</w:t>
       </w:r>
     </w:p>
     <w:p>
       <w:pPr>
-        <w:spacing w:after="100"/>
+        <w:pStyle w:val="ListBullet"/>
       </w:pPr>
       <w:r>
-        <w:rPr>
-          <w:b/>
-        </w:rPr>
-        <w:t xml:space="preserve">Итог: </w:t>
-      </w:r>
-      <w:r>
-        <w:t>Изменения не требуются.</w:t>
+        <w:t>Сохранены 75 наблюдений по конкретным запросам обычной выдачи Яндекса. Каждое относится только к той формулировке, которая действительно проверялась.</w:t>
       </w:r>
     </w:p>
     <w:p>
       <w:pPr>
-        <w:spacing w:after="100"/>
+        <w:pStyle w:val="ListBullet"/>
       </w:pPr>
       <w:r>
-        <w:t>Неоднозначность запроса подтверждена; нельзя расширять узкую инструкцию догадкой.</w:t>
+        <w:t>Отдельно разобрана 21 важная тема спроса, где пользователю могут отвечать несколько близких по теме страниц.</w:t>
       </w:r>
     </w:p>
     <w:p>
       <w:pPr>
-        <w:spacing w:after="100"/>
+        <w:pStyle w:val="ListBullet"/>
       </w:pPr>
       <w:r>
-        <w:rPr>
-          <w:b/>
-        </w:rPr>
-        <w:t xml:space="preserve">Ограничение: </w:t>
-      </w:r>
-      <w:r>
-        <w:t>вывод относится к этому проверенному случаю и не доказывает долгосрочную стабильность выдачи, приоритет источников, трафик или конверсию.</w:t>
+        <w:t>Для восьми важных тем выводы дополнительно сверены с автоматическими ответами поиска Яндекса.</w:t>
       </w:r>
     </w:p>
     <w:p>
       <w:pPr>
-        <w:pStyle w:val="Heading2"/>
+        <w:pStyle w:val="ListBullet"/>
       </w:pPr>
       <w:r>
-        <w:t>8. Запрос: «Лучшие пластиковые окна»</w:t>
+        <w:t>Сформирована сводная карта 34 значимых выводов исследования и отдельный список реальных доработок.</w:t>
       </w:r>
     </w:p>
     <w:p>
       <w:pPr>
-        <w:spacing w:after="100"/>
+        <w:pStyle w:val="Heading2"/>
       </w:pPr>
       <w:r>
-        <w:rPr>
-          <w:b/>
-        </w:rPr>
-        <w:t xml:space="preserve">Итог: </w:t>
-      </w:r>
-      <w:r>
-        <w:t>Доказательств недостаточно.</w:t>
+        <w:t>Что важно учитывать при использовании результатов</w:t>
       </w:r>
     </w:p>
     <w:p>
       <w:pPr>
-        <w:spacing w:after="100"/>
+        <w:pStyle w:val="ListBullet"/>
       </w:pPr>
       <w:r>
-        <w:t>Ответ не доказал новую иерархию страниц. Допустима только проверка свежести, критериев и методики рейтинга.</w:t>
+        <w:t>Наблюдение по одному точному запросу относится именно к этой формулировке и не переносится автоматически на все похожие запросы.</w:t>
       </w:r>
     </w:p>
     <w:p>
       <w:pPr>
-        <w:spacing w:after="100"/>
+        <w:pStyle w:val="ListBullet"/>
       </w:pPr>
       <w:r>
-        <w:rPr>
-          <w:b/>
-        </w:rPr>
-        <w:t xml:space="preserve">Ограничение: </w:t>
-      </w:r>
-      <w:r>
-        <w:t>вывод относится к этому проверенному случаю и не доказывает долгосрочную стабильность выдачи, приоритет источников, трафик или конверсию.</w:t>
+        <w:t>Если несколько страниц отвечают на похожие вопросы, их нужно оценивать по задаче пользователя: какую именно часть выбора или услуги объясняет каждая страница.</w:t>
       </w:r>
     </w:p>
     <w:p>
       <w:pPr>
-        <w:pStyle w:val="Heading1"/>
+        <w:pStyle w:val="ListBullet"/>
       </w:pPr>
       <w:r>
-        <w:t>9. Все 75 сохранённых наблюдений обычного Яндекса</w:t>
+        <w:t>Если существующая страница уже подходит для запроса, изменение меню, ссылок или текста требуется только при наличии конкретной рекомендации в разделе 2.</w:t>
       </w:r>
     </w:p>
     <w:p>
       <w:pPr>
+        <w:pStyle w:val="ListBullet"/>
+      </w:pPr>
+      <w:r>
+        <w:t>Отсутствие страницы в одной конкретной выдаче Яндекса не означает, что такой страницы нет на сайте.</w:t>
+      </w:r>
+    </w:p>
+    <w:p>
+      <w:pPr>
+        <w:pStyle w:val="ListBullet"/>
+      </w:pPr>
+      <w:r>
+        <w:t>Исследование не обещает рост позиций, трафика, заявок или выручки без отдельных данных, которые могли бы это подтвердить.</w:t>
+      </w:r>
+    </w:p>
+    <w:p>
+      <w:pPr>
+        <w:pStyle w:val="Heading1"/>
+      </w:pPr>
+      <w:r>
+        <w:t>Итог</w:t>
+      </w:r>
+    </w:p>
+    <w:p>
+      <w:pPr>
         <w:spacing w:after="100"/>
       </w:pPr>
       <w:r>
-        <w:t>Каждая строка ниже относится к одному конкретному исходному запросу. Формулировки запросов сохранены в исходном написании, включая названия брендов латиницей там, где они так были зафиксированы. Наблюдение по одной строке не переносится автоматически на соседние запросы и само по себе не определяет владельца страницы.</w:t>
+        <w:t>Исследование дало владельцу понятную карту спроса по существующим страницам и конкретный план точечных улучшений. Семь доработок можно передавать в работу сразу. Ещё для двух тем достаточно получить короткое подтверждение от компании, после чего их можно сформулировать так же точно. Остальная часть исследования показывает, какие страницы уже правильно отвечают на свои группы запросов и какие роли между близкими темами важно сохранить при дальнейшей работе с сайтом.</w:t>
+      </w:r>
+    </w:p>
+    <w:p>
+      <w:pPr>
+        <w:pStyle w:val="Heading1"/>
+      </w:pPr>
+      <w:r>
+        <w:t>Приложение 1. Что показала выдача Яндекса по 75 конкретным запросам</w:t>
+      </w:r>
+    </w:p>
+    <w:p>
+      <w:pPr>
+        <w:spacing w:after="100"/>
+      </w:pPr>
+      <w:r>
+        <w:t>Каждая строка относится к одному конкретному исходному запросу. Формулировки сохранены в исходном написании, включая бренды латиницей там, где они так были зафиксированы. Наблюдение по одной строке не переносится автоматически на соседние запросы.</w:t>
       </w:r>
     </w:p>
     <w:tbl>
@@ -5602,7 +5713,7 @@
         <w:pStyle w:val="Heading1"/>
       </w:pPr>
       <w:r>
-        <w:t>10. Полная карта 34 решений</w:t>
+        <w:t>Приложение 2. Сводная карта результатов исследования</w:t>
       </w:r>
     </w:p>
     <w:p>
@@ -5610,7 +5721,7 @@
         <w:spacing w:after="100"/>
       </w:pPr>
       <w:r>
-        <w:t>Эта таблица нужна, чтобы не перепутать реальную задачу на сайт с аналитическим назначением или вопросом, который ещё нельзя внедрять.</w:t>
+        <w:t>Это справочная карта всех 34 значимых выводов исследования. Основной список реальных работ находится в разделе 2.</w:t>
       </w:r>
     </w:p>
     <w:tbl>
@@ -5656,22 +5767,22 @@
                 <w:rFonts w:ascii="Liberation Sans" w:hAnsi="Liberation Sans"/>
                 <w:sz w:val="17"/>
               </w:rPr>
-              <w:t>Решение</w:t>
-            </w:r>
-          </w:p>
-        </w:tc>
-        <w:tc>
-          <w:tcPr>
-            <w:tcW w:type="dxa" w:w="3400"/>
-            <w:vAlign w:val="center"/>
-          </w:tcPr>
-          <w:p>
-            <w:r>
-              <w:rPr>
-                <w:rFonts w:ascii="Liberation Sans" w:hAnsi="Liberation Sans"/>
-                <w:sz w:val="17"/>
-              </w:rPr>
-              <w:t>Состояние</w:t>
+              <w:t>Результат исследования</w:t>
+            </w:r>
+          </w:p>
+        </w:tc>
+        <w:tc>
+          <w:tcPr>
+            <w:tcW w:type="dxa" w:w="3400"/>
+            <w:vAlign w:val="center"/>
+          </w:tcPr>
+          <w:p>
+            <w:r>
+              <w:rPr>
+                <w:rFonts w:ascii="Liberation Sans" w:hAnsi="Liberation Sans"/>
+                <w:sz w:val="17"/>
+              </w:rPr>
+              <w:t>Что это означает для владельца</w:t>
             </w:r>
           </w:p>
         </w:tc>
@@ -5706,22 +5817,22 @@
                 <w:rFonts w:ascii="Liberation Sans" w:hAnsi="Liberation Sans"/>
                 <w:sz w:val="17"/>
               </w:rPr>
-              <w:t>Закрепить страницу отделки балкона за запросами об отделке без остекления; общую страницу балконов сохранить для комплексного остекления с ремонтом.</w:t>
-            </w:r>
-          </w:p>
-        </w:tc>
-        <w:tc>
-          <w:tcPr>
-            <w:tcW w:type="dxa" w:w="3400"/>
-            <w:vAlign w:val="center"/>
-          </w:tcPr>
-          <w:p>
-            <w:r>
-              <w:rPr>
-                <w:rFonts w:ascii="Liberation Sans" w:hAnsi="Liberation Sans"/>
-                <w:sz w:val="17"/>
-              </w:rPr>
-              <w:t>Только аналитическое назначение; физически сайт по этой строке не менять.</w:t>
+              <w:t>Запросы об отделке балкона без остекления относятся к странице отделки; общая страница балконов отвечает за комплексное остекление с ремонтом.</w:t>
+            </w:r>
+          </w:p>
+        </w:tc>
+        <w:tc>
+          <w:tcPr>
+            <w:tcW w:type="dxa" w:w="3400"/>
+            <w:vAlign w:val="center"/>
+          </w:tcPr>
+          <w:p>
+            <w:r>
+              <w:rPr>
+                <w:rFonts w:ascii="Liberation Sans" w:hAnsi="Liberation Sans"/>
+                <w:sz w:val="17"/>
+              </w:rPr>
+              <w:t>Роль существующей страницы подтверждена.</w:t>
             </w:r>
           </w:p>
         </w:tc>
@@ -5756,22 +5867,22 @@
                 <w:rFonts w:ascii="Liberation Sans" w:hAnsi="Liberation Sans"/>
                 <w:sz w:val="17"/>
               </w:rPr>
-              <w:t>Закрепить отдельную страницу раздвижных окон на балкон за точным раздвижным намерением; страницу холодного остекления сохранить для явно холодного сценария.</w:t>
-            </w:r>
-          </w:p>
-        </w:tc>
-        <w:tc>
-          <w:tcPr>
-            <w:tcW w:type="dxa" w:w="3400"/>
-            <w:vAlign w:val="center"/>
-          </w:tcPr>
-          <w:p>
-            <w:r>
-              <w:rPr>
-                <w:rFonts w:ascii="Liberation Sans" w:hAnsi="Liberation Sans"/>
-                <w:sz w:val="17"/>
-              </w:rPr>
-              <w:t>Только аналитическое назначение; физически сайт по этой строке не менять.</w:t>
+              <w:t>Раздвижное балконное остекление относится к специализированной странице раздвижных окон; холодный сценарий остаётся на странице холодного остекления.</w:t>
+            </w:r>
+          </w:p>
+        </w:tc>
+        <w:tc>
+          <w:tcPr>
+            <w:tcW w:type="dxa" w:w="3400"/>
+            <w:vAlign w:val="center"/>
+          </w:tcPr>
+          <w:p>
+            <w:r>
+              <w:rPr>
+                <w:rFonts w:ascii="Liberation Sans" w:hAnsi="Liberation Sans"/>
+                <w:sz w:val="17"/>
+              </w:rPr>
+              <w:t>Роль существующей страницы подтверждена.</w:t>
             </w:r>
           </w:p>
         </w:tc>
@@ -5806,22 +5917,22 @@
                 <w:rFonts w:ascii="Liberation Sans" w:hAnsi="Liberation Sans"/>
                 <w:sz w:val="17"/>
               </w:rPr>
-              <w:t>Развести роли общей панорамной страницы и страницы панорамных окон REHAU; до появления сильных данных не объединять и не удалять.</w:t>
-            </w:r>
-          </w:p>
-        </w:tc>
-        <w:tc>
-          <w:tcPr>
-            <w:tcW w:type="dxa" w:w="3400"/>
-            <w:vAlign w:val="center"/>
-          </w:tcPr>
-          <w:p>
-            <w:r>
-              <w:rPr>
-                <w:rFonts w:ascii="Liberation Sans" w:hAnsi="Liberation Sans"/>
-                <w:sz w:val="17"/>
-              </w:rPr>
-              <w:t>Нужна дополнительная проверка; до неё сайт не менять.</w:t>
+              <w:t>Общая панорамная страница и страница панорамных окон REHAU отвечают на разные уровни выбора: широкий и брендовый.</w:t>
+            </w:r>
+          </w:p>
+        </w:tc>
+        <w:tc>
+          <w:tcPr>
+            <w:tcW w:type="dxa" w:w="3400"/>
+            <w:vAlign w:val="center"/>
+          </w:tcPr>
+          <w:p>
+            <w:r>
+              <w:rPr>
+                <w:rFonts w:ascii="Liberation Sans" w:hAnsi="Liberation Sans"/>
+                <w:sz w:val="17"/>
+              </w:rPr>
+              <w:t>Текущее разделение страниц подтверждено; возвращаться к переработке стоит только при появлении новых данных.</w:t>
             </w:r>
           </w:p>
         </w:tc>
@@ -5856,22 +5967,22 @@
                 <w:rFonts w:ascii="Liberation Sans" w:hAnsi="Liberation Sans"/>
                 <w:sz w:val="17"/>
               </w:rPr>
-              <w:t>Развести роли основной страницы окон для частного дома и страницы для коттеджей и загородных домов; разрушительные действия не выполнять.</w:t>
-            </w:r>
-          </w:p>
-        </w:tc>
-        <w:tc>
-          <w:tcPr>
-            <w:tcW w:type="dxa" w:w="3400"/>
-            <w:vAlign w:val="center"/>
-          </w:tcPr>
-          <w:p>
-            <w:r>
-              <w:rPr>
-                <w:rFonts w:ascii="Liberation Sans" w:hAnsi="Liberation Sans"/>
-                <w:sz w:val="17"/>
-              </w:rPr>
-              <w:t>Нужна дополнительная проверка; до неё сайт не менять.</w:t>
+              <w:t>Страница окон для частного дома отвечает на широкую задачу, а страница для коттеджей и загородных домов — на более узкий контекст.</w:t>
+            </w:r>
+          </w:p>
+        </w:tc>
+        <w:tc>
+          <w:tcPr>
+            <w:tcW w:type="dxa" w:w="3400"/>
+            <w:vAlign w:val="center"/>
+          </w:tcPr>
+          <w:p>
+            <w:r>
+              <w:rPr>
+                <w:rFonts w:ascii="Liberation Sans" w:hAnsi="Liberation Sans"/>
+                <w:sz w:val="17"/>
+              </w:rPr>
+              <w:t>Текущее разделение страниц подтверждено; возвращаться к переработке стоит только при появлении новых данных.</w:t>
             </w:r>
           </w:p>
         </w:tc>
@@ -5906,22 +6017,22 @@
                 <w:rFonts w:ascii="Liberation Sans" w:hAnsi="Liberation Sans"/>
                 <w:sz w:val="17"/>
               </w:rPr>
-              <w:t>Закрепить страницу окон в деревянный дом за точным намерением; общую страницу частного дома оставить поддерживающей.</w:t>
-            </w:r>
-          </w:p>
-        </w:tc>
-        <w:tc>
-          <w:tcPr>
-            <w:tcW w:type="dxa" w:w="3400"/>
-            <w:vAlign w:val="center"/>
-          </w:tcPr>
-          <w:p>
-            <w:r>
-              <w:rPr>
-                <w:rFonts w:ascii="Liberation Sans" w:hAnsi="Liberation Sans"/>
-                <w:sz w:val="17"/>
-              </w:rPr>
-              <w:t>Только аналитическое назначение; физически сайт по этой строке не менять.</w:t>
+              <w:t>Запросы об окнах в деревянный дом относятся к специализированной странице, а общая страница частного дома даёт более широкий контекст.</w:t>
+            </w:r>
+          </w:p>
+        </w:tc>
+        <w:tc>
+          <w:tcPr>
+            <w:tcW w:type="dxa" w:w="3400"/>
+            <w:vAlign w:val="center"/>
+          </w:tcPr>
+          <w:p>
+            <w:r>
+              <w:rPr>
+                <w:rFonts w:ascii="Liberation Sans" w:hAnsi="Liberation Sans"/>
+                <w:sz w:val="17"/>
+              </w:rPr>
+              <w:t>Роль существующей страницы подтверждена.</w:t>
             </w:r>
           </w:p>
         </w:tc>
@@ -5956,22 +6067,22 @@
                 <w:rFonts w:ascii="Liberation Sans" w:hAnsi="Liberation Sans"/>
                 <w:sz w:val="17"/>
               </w:rPr>
-              <w:t>Коммерческий выбор стеклопакета направлять на товарный раздел стеклопакетов; информационную задачу о видах стеклопакетов сохранять отдельно.</w:t>
-            </w:r>
-          </w:p>
-        </w:tc>
-        <w:tc>
-          <w:tcPr>
-            <w:tcW w:type="dxa" w:w="3400"/>
-            <w:vAlign w:val="center"/>
-          </w:tcPr>
-          <w:p>
-            <w:r>
-              <w:rPr>
-                <w:rFonts w:ascii="Liberation Sans" w:hAnsi="Liberation Sans"/>
-                <w:sz w:val="17"/>
-              </w:rPr>
-              <w:t>Только аналитическое назначение; физически сайт по этой строке не менять.</w:t>
+              <w:t>Коммерческий выбор стеклопакета относится к товарному разделу; объяснение видов стеклопакетов остаётся в информационном материале.</w:t>
+            </w:r>
+          </w:p>
+        </w:tc>
+        <w:tc>
+          <w:tcPr>
+            <w:tcW w:type="dxa" w:w="3400"/>
+            <w:vAlign w:val="center"/>
+          </w:tcPr>
+          <w:p>
+            <w:r>
+              <w:rPr>
+                <w:rFonts w:ascii="Liberation Sans" w:hAnsi="Liberation Sans"/>
+                <w:sz w:val="17"/>
+              </w:rPr>
+              <w:t>Роль существующей страницы подтверждена.</w:t>
             </w:r>
           </w:p>
         </w:tc>
@@ -6006,22 +6117,22 @@
                 <w:rFonts w:ascii="Liberation Sans" w:hAnsi="Liberation Sans"/>
                 <w:sz w:val="17"/>
               </w:rPr>
-              <w:t>Развести продуктовый блок сравнения REHAU и отдельную статью сравнения; до проверки сохранить продуктовый раздел основным.</w:t>
-            </w:r>
-          </w:p>
-        </w:tc>
-        <w:tc>
-          <w:tcPr>
-            <w:tcW w:type="dxa" w:w="3400"/>
-            <w:vAlign w:val="center"/>
-          </w:tcPr>
-          <w:p>
-            <w:r>
-              <w:rPr>
-                <w:rFonts w:ascii="Liberation Sans" w:hAnsi="Liberation Sans"/>
-                <w:sz w:val="17"/>
-              </w:rPr>
-              <w:t>Нужна дополнительная проверка; до неё сайт не менять.</w:t>
+              <w:t>Продуктовый блок сравнения REHAU и отдельная статья выполняют разные задачи: быстрый выбор и подробное объяснение.</w:t>
+            </w:r>
+          </w:p>
+        </w:tc>
+        <w:tc>
+          <w:tcPr>
+            <w:tcW w:type="dxa" w:w="3400"/>
+            <w:vAlign w:val="center"/>
+          </w:tcPr>
+          <w:p>
+            <w:r>
+              <w:rPr>
+                <w:rFonts w:ascii="Liberation Sans" w:hAnsi="Liberation Sans"/>
+                <w:sz w:val="17"/>
+              </w:rPr>
+              <w:t>Текущее разделение страниц подтверждено; возвращаться к переработке стоит только при появлении новых данных.</w:t>
             </w:r>
           </w:p>
         </w:tc>
@@ -6056,22 +6167,22 @@
                 <w:rFonts w:ascii="Liberation Sans" w:hAnsi="Liberation Sans"/>
                 <w:sz w:val="17"/>
               </w:rPr>
-              <w:t>Закрепить страницу раздвижных окон на веранду за точным раздвижным намерением; общую страницу веранды сохранить для общего сценария.</w:t>
-            </w:r>
-          </w:p>
-        </w:tc>
-        <w:tc>
-          <w:tcPr>
-            <w:tcW w:type="dxa" w:w="3400"/>
-            <w:vAlign w:val="center"/>
-          </w:tcPr>
-          <w:p>
-            <w:r>
-              <w:rPr>
-                <w:rFonts w:ascii="Liberation Sans" w:hAnsi="Liberation Sans"/>
-                <w:sz w:val="17"/>
-              </w:rPr>
-              <w:t>Только аналитическое назначение; физически сайт по этой строке не менять.</w:t>
+              <w:t>Раздвижные окна на веранду относятся к специализированной странице; общая страница веранды отвечает за общий выбор остекления.</w:t>
+            </w:r>
+          </w:p>
+        </w:tc>
+        <w:tc>
+          <w:tcPr>
+            <w:tcW w:type="dxa" w:w="3400"/>
+            <w:vAlign w:val="center"/>
+          </w:tcPr>
+          <w:p>
+            <w:r>
+              <w:rPr>
+                <w:rFonts w:ascii="Liberation Sans" w:hAnsi="Liberation Sans"/>
+                <w:sz w:val="17"/>
+              </w:rPr>
+              <w:t>Роль существующей страницы подтверждена.</w:t>
             </w:r>
           </w:p>
         </w:tc>
@@ -6106,22 +6217,22 @@
                 <w:rFonts w:ascii="Liberation Sans" w:hAnsi="Liberation Sans"/>
                 <w:sz w:val="17"/>
               </w:rPr>
-              <w:t>Усилить существующую страницу французских окон: конфигурации, замена балконного блока и ясное отличие французского решения от общего панорамного остекления.</w:t>
-            </w:r>
-          </w:p>
-        </w:tc>
-        <w:tc>
-          <w:tcPr>
-            <w:tcW w:type="dxa" w:w="3400"/>
-            <w:vAlign w:val="center"/>
-          </w:tcPr>
-          <w:p>
-            <w:r>
-              <w:rPr>
-                <w:rFonts w:ascii="Liberation Sans" w:hAnsi="Liberation Sans"/>
-                <w:sz w:val="17"/>
-              </w:rPr>
-              <w:t>Готово к внедрению на сайте.</w:t>
+              <w:t>Страницу французских окон нужно усилить сравнением конфигураций, заменой балконного блока и отличием от общего панорамного остекления.</w:t>
+            </w:r>
+          </w:p>
+        </w:tc>
+        <w:tc>
+          <w:tcPr>
+            <w:tcW w:type="dxa" w:w="3400"/>
+            <w:vAlign w:val="center"/>
+          </w:tcPr>
+          <w:p>
+            <w:r>
+              <w:rPr>
+                <w:rFonts w:ascii="Liberation Sans" w:hAnsi="Liberation Sans"/>
+                <w:sz w:val="17"/>
+              </w:rPr>
+              <w:t>Готово к доработке.</w:t>
             </w:r>
           </w:p>
         </w:tc>
@@ -6156,22 +6267,22 @@
                 <w:rFonts w:ascii="Liberation Sans" w:hAnsi="Liberation Sans"/>
                 <w:sz w:val="17"/>
               </w:rPr>
-              <w:t>Добавить на страницу окон для частного дома понятную модель типовых и нетиповых проёмов и объяснить приоритет индивидуального замера.</w:t>
-            </w:r>
-          </w:p>
-        </w:tc>
-        <w:tc>
-          <w:tcPr>
-            <w:tcW w:type="dxa" w:w="3400"/>
-            <w:vAlign w:val="center"/>
-          </w:tcPr>
-          <w:p>
-            <w:r>
-              <w:rPr>
-                <w:rFonts w:ascii="Liberation Sans" w:hAnsi="Liberation Sans"/>
-                <w:sz w:val="17"/>
-              </w:rPr>
-              <w:t>Готово к внедрению на сайте.</w:t>
+              <w:t>На странице окон для частного дома нужно объяснить типовые и нетиповые проёмы и роль индивидуального замера.</w:t>
+            </w:r>
+          </w:p>
+        </w:tc>
+        <w:tc>
+          <w:tcPr>
+            <w:tcW w:type="dxa" w:w="3400"/>
+            <w:vAlign w:val="center"/>
+          </w:tcPr>
+          <w:p>
+            <w:r>
+              <w:rPr>
+                <w:rFonts w:ascii="Liberation Sans" w:hAnsi="Liberation Sans"/>
+                <w:sz w:val="17"/>
+              </w:rPr>
+              <w:t>Готово к доработке.</w:t>
             </w:r>
           </w:p>
         </w:tc>
@@ -6206,22 +6317,22 @@
                 <w:rFonts w:ascii="Liberation Sans" w:hAnsi="Liberation Sans"/>
                 <w:sz w:val="17"/>
               </w:rPr>
-              <w:t>Проверить фактическую доступность Accado, Vorne и Futurus до расширения раздела о фурнитуре; неподтверждённые бренды не обещать.</w:t>
-            </w:r>
-          </w:p>
-        </w:tc>
-        <w:tc>
-          <w:tcPr>
-            <w:tcW w:type="dxa" w:w="3400"/>
-            <w:vAlign w:val="center"/>
-          </w:tcPr>
-          <w:p>
-            <w:r>
-              <w:rPr>
-                <w:rFonts w:ascii="Liberation Sans" w:hAnsi="Liberation Sans"/>
-                <w:sz w:val="17"/>
-              </w:rPr>
-              <w:t>Нужна дополнительная проверка; до неё сайт не менять.</w:t>
+              <w:t>Перед расширением раздела о фурнитуре нужно подтвердить фактическую доступность Accado, Vorne и Futurus.</w:t>
+            </w:r>
+          </w:p>
+        </w:tc>
+        <w:tc>
+          <w:tcPr>
+            <w:tcW w:type="dxa" w:w="3400"/>
+            <w:vAlign w:val="center"/>
+          </w:tcPr>
+          <w:p>
+            <w:r>
+              <w:rPr>
+                <w:rFonts w:ascii="Liberation Sans" w:hAnsi="Liberation Sans"/>
+                <w:sz w:val="17"/>
+              </w:rPr>
+              <w:t>Нужно подтвердить ассортимент компании перед доработкой текста.</w:t>
             </w:r>
           </w:p>
         </w:tc>
@@ -6256,22 +6367,22 @@
                 <w:rFonts w:ascii="Liberation Sans" w:hAnsi="Liberation Sans"/>
                 <w:sz w:val="17"/>
               </w:rPr>
-              <w:t>Сохранить существующие цену, калькулятор и путь к замеру; добавить только нейтральное объяснение роли профессионального монтажа, а фактический состав услуги раскрывать после подтверждения компанией.</w:t>
-            </w:r>
-          </w:p>
-        </w:tc>
-        <w:tc>
-          <w:tcPr>
-            <w:tcW w:type="dxa" w:w="3400"/>
-            <w:vAlign w:val="center"/>
-          </w:tcPr>
-          <w:p>
-            <w:r>
-              <w:rPr>
-                <w:rFonts w:ascii="Liberation Sans" w:hAnsi="Liberation Sans"/>
-                <w:sz w:val="17"/>
-              </w:rPr>
-              <w:t>Готова только нейтральная часть; фактический состав услуги требует подтверждения компании.</w:t>
+              <w:t>Для точного блока о монтаже пластиковых дверей компания должна подтвердить состав услуги; существующие цены, калькулятор и путь к замеру уже полезны и сохраняются.</w:t>
+            </w:r>
+          </w:p>
+        </w:tc>
+        <w:tc>
+          <w:tcPr>
+            <w:tcW w:type="dxa" w:w="3400"/>
+            <w:vAlign w:val="center"/>
+          </w:tcPr>
+          <w:p>
+            <w:r>
+              <w:rPr>
+                <w:rFonts w:ascii="Liberation Sans" w:hAnsi="Liberation Sans"/>
+                <w:sz w:val="17"/>
+              </w:rPr>
+              <w:t>Нужны данные компании, после чего можно подготовить точный блок.</w:t>
             </w:r>
           </w:p>
         </w:tc>
@@ -6306,22 +6417,22 @@
                 <w:rFonts w:ascii="Liberation Sans" w:hAnsi="Liberation Sans"/>
                 <w:sz w:val="17"/>
               </w:rPr>
-              <w:t>Учитывать страницу Provedal как узкую поддержку алюминиевых и холодных раздвижных задач; общих владельцев не заменять.</w:t>
-            </w:r>
-          </w:p>
-        </w:tc>
-        <w:tc>
-          <w:tcPr>
-            <w:tcW w:type="dxa" w:w="3400"/>
-            <w:vAlign w:val="center"/>
-          </w:tcPr>
-          <w:p>
-            <w:r>
-              <w:rPr>
-                <w:rFonts w:ascii="Liberation Sans" w:hAnsi="Liberation Sans"/>
-                <w:sz w:val="17"/>
-              </w:rPr>
-              <w:t>Только аналитическое назначение; физически сайт по этой строке не менять.</w:t>
+              <w:t>Страница Provedal служит специализированной поддержкой для алюминиевых и холодных раздвижных решений.</w:t>
+            </w:r>
+          </w:p>
+        </w:tc>
+        <w:tc>
+          <w:tcPr>
+            <w:tcW w:type="dxa" w:w="3400"/>
+            <w:vAlign w:val="center"/>
+          </w:tcPr>
+          <w:p>
+            <w:r>
+              <w:rPr>
+                <w:rFonts w:ascii="Liberation Sans" w:hAnsi="Liberation Sans"/>
+                <w:sz w:val="17"/>
+              </w:rPr>
+              <w:t>Роль существующей страницы подтверждена.</w:t>
             </w:r>
           </w:p>
         </w:tc>
@@ -6356,22 +6467,22 @@
                 <w:rFonts w:ascii="Liberation Sans" w:hAnsi="Liberation Sans"/>
                 <w:sz w:val="17"/>
               </w:rPr>
-              <w:t>Учитывать балконную страницу французского остекления как поддержку пересечения; основные французский и панорамно-балконный владельцы сохраняются.</w:t>
-            </w:r>
-          </w:p>
-        </w:tc>
-        <w:tc>
-          <w:tcPr>
-            <w:tcW w:type="dxa" w:w="3400"/>
-            <w:vAlign w:val="center"/>
-          </w:tcPr>
-          <w:p>
-            <w:r>
-              <w:rPr>
-                <w:rFonts w:ascii="Liberation Sans" w:hAnsi="Liberation Sans"/>
-                <w:sz w:val="17"/>
-              </w:rPr>
-              <w:t>Только аналитическое назначение; физически сайт по этой строке не менять.</w:t>
+              <w:t>Балконная страница французского остекления дополняет основные страницы французского и панорамно-балконного решения.</w:t>
+            </w:r>
+          </w:p>
+        </w:tc>
+        <w:tc>
+          <w:tcPr>
+            <w:tcW w:type="dxa" w:w="3400"/>
+            <w:vAlign w:val="center"/>
+          </w:tcPr>
+          <w:p>
+            <w:r>
+              <w:rPr>
+                <w:rFonts w:ascii="Liberation Sans" w:hAnsi="Liberation Sans"/>
+                <w:sz w:val="17"/>
+              </w:rPr>
+              <w:t>Роль существующей страницы подтверждена.</w:t>
             </w:r>
           </w:p>
         </w:tc>
@@ -6406,22 +6517,22 @@
                 <w:rFonts w:ascii="Liberation Sans" w:hAnsi="Liberation Sans"/>
                 <w:sz w:val="17"/>
               </w:rPr>
-              <w:t>Учитывать страницу холодного панорамного балкона для точного пересечения; вне него сохранять общих владельцев.</w:t>
-            </w:r>
-          </w:p>
-        </w:tc>
-        <w:tc>
-          <w:tcPr>
-            <w:tcW w:type="dxa" w:w="3400"/>
-            <w:vAlign w:val="center"/>
-          </w:tcPr>
-          <w:p>
-            <w:r>
-              <w:rPr>
-                <w:rFonts w:ascii="Liberation Sans" w:hAnsi="Liberation Sans"/>
-                <w:sz w:val="17"/>
-              </w:rPr>
-              <w:t>Только аналитическое назначение; физически сайт по этой строке не менять.</w:t>
+              <w:t>Страница холодного панорамного балкона отвечает на точное сочетание холодного и панорамного сценария.</w:t>
+            </w:r>
+          </w:p>
+        </w:tc>
+        <w:tc>
+          <w:tcPr>
+            <w:tcW w:type="dxa" w:w="3400"/>
+            <w:vAlign w:val="center"/>
+          </w:tcPr>
+          <w:p>
+            <w:r>
+              <w:rPr>
+                <w:rFonts w:ascii="Liberation Sans" w:hAnsi="Liberation Sans"/>
+                <w:sz w:val="17"/>
+              </w:rPr>
+              <w:t>Роль существующей страницы подтверждена.</w:t>
             </w:r>
           </w:p>
         </w:tc>
@@ -6456,22 +6567,22 @@
                 <w:rFonts w:ascii="Liberation Sans" w:hAnsi="Liberation Sans"/>
                 <w:sz w:val="17"/>
               </w:rPr>
-              <w:t>Учитывать страницу остекления системой Provedal как точную поддержку; широкого и холодного владельца выбирать по намерению.</w:t>
-            </w:r>
-          </w:p>
-        </w:tc>
-        <w:tc>
-          <w:tcPr>
-            <w:tcW w:type="dxa" w:w="3400"/>
-            <w:vAlign w:val="center"/>
-          </w:tcPr>
-          <w:p>
-            <w:r>
-              <w:rPr>
-                <w:rFonts w:ascii="Liberation Sans" w:hAnsi="Liberation Sans"/>
-                <w:sz w:val="17"/>
-              </w:rPr>
-              <w:t>Только аналитическое назначение; физически сайт по этой строке не менять.</w:t>
+              <w:t>Страница остекления системой Provedal отвечает на точный сценарий этой системы; общий и холодный выбор остаются на соответствующих более широких страницах.</w:t>
+            </w:r>
+          </w:p>
+        </w:tc>
+        <w:tc>
+          <w:tcPr>
+            <w:tcW w:type="dxa" w:w="3400"/>
+            <w:vAlign w:val="center"/>
+          </w:tcPr>
+          <w:p>
+            <w:r>
+              <w:rPr>
+                <w:rFonts w:ascii="Liberation Sans" w:hAnsi="Liberation Sans"/>
+                <w:sz w:val="17"/>
+              </w:rPr>
+              <w:t>Роль существующей страницы подтверждена.</w:t>
             </w:r>
           </w:p>
         </w:tc>
@@ -6506,22 +6617,22 @@
                 <w:rFonts w:ascii="Liberation Sans" w:hAnsi="Liberation Sans"/>
                 <w:sz w:val="17"/>
               </w:rPr>
-              <w:t>Маршрутизировать изготовление стеклопакетов на заказ на существующую специализированную страницу внутри коммерческого семейства.</w:t>
-            </w:r>
-          </w:p>
-        </w:tc>
-        <w:tc>
-          <w:tcPr>
-            <w:tcW w:type="dxa" w:w="3400"/>
-            <w:vAlign w:val="center"/>
-          </w:tcPr>
-          <w:p>
-            <w:r>
-              <w:rPr>
-                <w:rFonts w:ascii="Liberation Sans" w:hAnsi="Liberation Sans"/>
-                <w:sz w:val="17"/>
-              </w:rPr>
-              <w:t>Только аналитическое назначение; физически сайт по этой строке не менять.</w:t>
+              <w:t>Изготовление стеклопакетов на заказ относится к существующей специализированной коммерческой странице.</w:t>
+            </w:r>
+          </w:p>
+        </w:tc>
+        <w:tc>
+          <w:tcPr>
+            <w:tcW w:type="dxa" w:w="3400"/>
+            <w:vAlign w:val="center"/>
+          </w:tcPr>
+          <w:p>
+            <w:r>
+              <w:rPr>
+                <w:rFonts w:ascii="Liberation Sans" w:hAnsi="Liberation Sans"/>
+                <w:sz w:val="17"/>
+              </w:rPr>
+              <w:t>Роль существующей страницы подтверждена.</w:t>
             </w:r>
           </w:p>
         </w:tc>
@@ -6556,22 +6667,22 @@
                 <w:rFonts w:ascii="Liberation Sans" w:hAnsi="Liberation Sans"/>
                 <w:sz w:val="17"/>
               </w:rPr>
-              <w:t>Учитывать страницу окон на кухню как комнатную поддержку; не выделять новую страницу для агрегированной комнатной группы.</w:t>
-            </w:r>
-          </w:p>
-        </w:tc>
-        <w:tc>
-          <w:tcPr>
-            <w:tcW w:type="dxa" w:w="3400"/>
-            <w:vAlign w:val="center"/>
-          </w:tcPr>
-          <w:p>
-            <w:r>
-              <w:rPr>
-                <w:rFonts w:ascii="Liberation Sans" w:hAnsi="Liberation Sans"/>
-                <w:sz w:val="17"/>
-              </w:rPr>
-              <w:t>Только аналитическое назначение; физически сайт по этой строке не менять.</w:t>
+              <w:t>Страница окон на кухню помогает ответить на комнатный сценарий внутри уже существующей структуры сайта.</w:t>
+            </w:r>
+          </w:p>
+        </w:tc>
+        <w:tc>
+          <w:tcPr>
+            <w:tcW w:type="dxa" w:w="3400"/>
+            <w:vAlign w:val="center"/>
+          </w:tcPr>
+          <w:p>
+            <w:r>
+              <w:rPr>
+                <w:rFonts w:ascii="Liberation Sans" w:hAnsi="Liberation Sans"/>
+                <w:sz w:val="17"/>
+              </w:rPr>
+              <w:t>Роль существующей страницы подтверждена.</w:t>
             </w:r>
           </w:p>
         </w:tc>
@@ -6606,22 +6717,22 @@
                 <w:rFonts w:ascii="Liberation Sans" w:hAnsi="Liberation Sans"/>
                 <w:sz w:val="17"/>
               </w:rPr>
-              <w:t>Учитывать коммерческий раздел типовых размеров как поддержку, сохраняя информационного владельца размерной задачи.</w:t>
-            </w:r>
-          </w:p>
-        </w:tc>
-        <w:tc>
-          <w:tcPr>
-            <w:tcW w:type="dxa" w:w="3400"/>
-            <w:vAlign w:val="center"/>
-          </w:tcPr>
-          <w:p>
-            <w:r>
-              <w:rPr>
-                <w:rFonts w:ascii="Liberation Sans" w:hAnsi="Liberation Sans"/>
-                <w:sz w:val="17"/>
-              </w:rPr>
-              <w:t>Только аналитическое назначение; физически сайт по этой строке не менять.</w:t>
+              <w:t>Коммерческий раздел типовых размеров дополняет информационный материал о размерах.</w:t>
+            </w:r>
+          </w:p>
+        </w:tc>
+        <w:tc>
+          <w:tcPr>
+            <w:tcW w:type="dxa" w:w="3400"/>
+            <w:vAlign w:val="center"/>
+          </w:tcPr>
+          <w:p>
+            <w:r>
+              <w:rPr>
+                <w:rFonts w:ascii="Liberation Sans" w:hAnsi="Liberation Sans"/>
+                <w:sz w:val="17"/>
+              </w:rPr>
+              <w:t>Роль существующей страницы подтверждена.</w:t>
             </w:r>
           </w:p>
         </w:tc>
@@ -6656,22 +6767,22 @@
                 <w:rFonts w:ascii="Liberation Sans" w:hAnsi="Liberation Sans"/>
                 <w:sz w:val="17"/>
               </w:rPr>
-              <w:t>Учитывать каталог типовых окон как коммерческую поддержку информационной задачи о размерах.</w:t>
-            </w:r>
-          </w:p>
-        </w:tc>
-        <w:tc>
-          <w:tcPr>
-            <w:tcW w:type="dxa" w:w="3400"/>
-            <w:vAlign w:val="center"/>
-          </w:tcPr>
-          <w:p>
-            <w:r>
-              <w:rPr>
-                <w:rFonts w:ascii="Liberation Sans" w:hAnsi="Liberation Sans"/>
-                <w:sz w:val="17"/>
-              </w:rPr>
-              <w:t>Только аналитическое назначение; физически сайт по этой строке не менять.</w:t>
+              <w:t>Каталог типовых окон дополняет информационный материал о размерах конкретными вариантами.</w:t>
+            </w:r>
+          </w:p>
+        </w:tc>
+        <w:tc>
+          <w:tcPr>
+            <w:tcW w:type="dxa" w:w="3400"/>
+            <w:vAlign w:val="center"/>
+          </w:tcPr>
+          <w:p>
+            <w:r>
+              <w:rPr>
+                <w:rFonts w:ascii="Liberation Sans" w:hAnsi="Liberation Sans"/>
+                <w:sz w:val="17"/>
+              </w:rPr>
+              <w:t>Роль существующей страницы подтверждена.</w:t>
             </w:r>
           </w:p>
         </w:tc>
@@ -6706,22 +6817,22 @@
                 <w:rFonts w:ascii="Liberation Sans" w:hAnsi="Liberation Sans"/>
                 <w:sz w:val="17"/>
               </w:rPr>
-              <w:t>Учитывать квартирное руководство как узкую поддержку, не заменяя им широкие страницы выбора и сравнения.</w:t>
-            </w:r>
-          </w:p>
-        </w:tc>
-        <w:tc>
-          <w:tcPr>
-            <w:tcW w:type="dxa" w:w="3400"/>
-            <w:vAlign w:val="center"/>
-          </w:tcPr>
-          <w:p>
-            <w:r>
-              <w:rPr>
-                <w:rFonts w:ascii="Liberation Sans" w:hAnsi="Liberation Sans"/>
-                <w:sz w:val="17"/>
-              </w:rPr>
-              <w:t>Только аналитическое назначение; физически сайт по этой строке не менять.</w:t>
+              <w:t>Квартирное руководство дополняет широкие страницы выбора и сравнения окон.</w:t>
+            </w:r>
+          </w:p>
+        </w:tc>
+        <w:tc>
+          <w:tcPr>
+            <w:tcW w:type="dxa" w:w="3400"/>
+            <w:vAlign w:val="center"/>
+          </w:tcPr>
+          <w:p>
+            <w:r>
+              <w:rPr>
+                <w:rFonts w:ascii="Liberation Sans" w:hAnsi="Liberation Sans"/>
+                <w:sz w:val="17"/>
+              </w:rPr>
+              <w:t>Роль существующей страницы подтверждена.</w:t>
             </w:r>
           </w:p>
         </w:tc>
@@ -6756,22 +6867,22 @@
                 <w:rFonts w:ascii="Liberation Sans" w:hAnsi="Liberation Sans"/>
                 <w:sz w:val="17"/>
               </w:rPr>
-              <w:t>Учитывать статью о профиле и производителе как узкую поддержку, не заменяя широкую страницу выбора.</w:t>
-            </w:r>
-          </w:p>
-        </w:tc>
-        <w:tc>
-          <w:tcPr>
-            <w:tcW w:type="dxa" w:w="3400"/>
-            <w:vAlign w:val="center"/>
-          </w:tcPr>
-          <w:p>
-            <w:r>
-              <w:rPr>
-                <w:rFonts w:ascii="Liberation Sans" w:hAnsi="Liberation Sans"/>
-                <w:sz w:val="17"/>
-              </w:rPr>
-              <w:t>Только аналитическое назначение; физически сайт по этой строке не менять.</w:t>
+              <w:t>Статья о профиле и производителе дополняет широкую страницу выбора.</w:t>
+            </w:r>
+          </w:p>
+        </w:tc>
+        <w:tc>
+          <w:tcPr>
+            <w:tcW w:type="dxa" w:w="3400"/>
+            <w:vAlign w:val="center"/>
+          </w:tcPr>
+          <w:p>
+            <w:r>
+              <w:rPr>
+                <w:rFonts w:ascii="Liberation Sans" w:hAnsi="Liberation Sans"/>
+                <w:sz w:val="17"/>
+              </w:rPr>
+              <w:t>Роль существующей страницы подтверждена.</w:t>
             </w:r>
           </w:p>
         </w:tc>
@@ -6806,22 +6917,22 @@
                 <w:rFonts w:ascii="Liberation Sans" w:hAnsi="Liberation Sans"/>
                 <w:sz w:val="17"/>
               </w:rPr>
-              <w:t>Информационную статью о видах стеклопакетов использовать как поддержку, не смешивая её с коммерческим товарным разделом.</w:t>
-            </w:r>
-          </w:p>
-        </w:tc>
-        <w:tc>
-          <w:tcPr>
-            <w:tcW w:type="dxa" w:w="3400"/>
-            <w:vAlign w:val="center"/>
-          </w:tcPr>
-          <w:p>
-            <w:r>
-              <w:rPr>
-                <w:rFonts w:ascii="Liberation Sans" w:hAnsi="Liberation Sans"/>
-                <w:sz w:val="17"/>
-              </w:rPr>
-              <w:t>Только аналитическое назначение; физически сайт по этой строке не менять.</w:t>
+              <w:t>Информационная статья о видах стеклопакетов объясняет выбор, а товарный раздел отвечает за покупку.</w:t>
+            </w:r>
+          </w:p>
+        </w:tc>
+        <w:tc>
+          <w:tcPr>
+            <w:tcW w:type="dxa" w:w="3400"/>
+            <w:vAlign w:val="center"/>
+          </w:tcPr>
+          <w:p>
+            <w:r>
+              <w:rPr>
+                <w:rFonts w:ascii="Liberation Sans" w:hAnsi="Liberation Sans"/>
+                <w:sz w:val="17"/>
+              </w:rPr>
+              <w:t>Роль существующей страницы подтверждена.</w:t>
             </w:r>
           </w:p>
         </w:tc>
@@ -6856,22 +6967,22 @@
                 <w:rFonts w:ascii="Liberation Sans" w:hAnsi="Liberation Sans"/>
                 <w:sz w:val="17"/>
               </w:rPr>
-              <w:t>Статью о видах остекления веранды использовать для объяснения выбора, а общую страницу веранды сохранить коммерческой.</w:t>
-            </w:r>
-          </w:p>
-        </w:tc>
-        <w:tc>
-          <w:tcPr>
-            <w:tcW w:type="dxa" w:w="3400"/>
-            <w:vAlign w:val="center"/>
-          </w:tcPr>
-          <w:p>
-            <w:r>
-              <w:rPr>
-                <w:rFonts w:ascii="Liberation Sans" w:hAnsi="Liberation Sans"/>
-                <w:sz w:val="17"/>
-              </w:rPr>
-              <w:t>Только аналитическое назначение; физически сайт по этой строке не менять.</w:t>
+              <w:t>Статья о видах остекления веранды объясняет варианты, а общая страница веранды отвечает за коммерческий выбор.</w:t>
+            </w:r>
+          </w:p>
+        </w:tc>
+        <w:tc>
+          <w:tcPr>
+            <w:tcW w:type="dxa" w:w="3400"/>
+            <w:vAlign w:val="center"/>
+          </w:tcPr>
+          <w:p>
+            <w:r>
+              <w:rPr>
+                <w:rFonts w:ascii="Liberation Sans" w:hAnsi="Liberation Sans"/>
+                <w:sz w:val="17"/>
+              </w:rPr>
+              <w:t>Роль существующей страницы подтверждена.</w:t>
             </w:r>
           </w:p>
         </w:tc>
@@ -6906,22 +7017,22 @@
                 <w:rFonts w:ascii="Liberation Sans" w:hAnsi="Liberation Sans"/>
                 <w:sz w:val="17"/>
               </w:rPr>
-              <w:t>Страницу безрамного остекления веранды использовать для точного безрамного намерения; общую страницу веранды оставить для общего сценария.</w:t>
-            </w:r>
-          </w:p>
-        </w:tc>
-        <w:tc>
-          <w:tcPr>
-            <w:tcW w:type="dxa" w:w="3400"/>
-            <w:vAlign w:val="center"/>
-          </w:tcPr>
-          <w:p>
-            <w:r>
-              <w:rPr>
-                <w:rFonts w:ascii="Liberation Sans" w:hAnsi="Liberation Sans"/>
-                <w:sz w:val="17"/>
-              </w:rPr>
-              <w:t>Только аналитическое назначение; физически сайт по этой строке не менять.</w:t>
+              <w:t>Страница безрамного остекления веранды отвечает на явный безрамный сценарий, общая страница — на общий выбор.</w:t>
+            </w:r>
+          </w:p>
+        </w:tc>
+        <w:tc>
+          <w:tcPr>
+            <w:tcW w:type="dxa" w:w="3400"/>
+            <w:vAlign w:val="center"/>
+          </w:tcPr>
+          <w:p>
+            <w:r>
+              <w:rPr>
+                <w:rFonts w:ascii="Liberation Sans" w:hAnsi="Liberation Sans"/>
+                <w:sz w:val="17"/>
+              </w:rPr>
+              <w:t>Роль существующей страницы подтверждена.</w:t>
             </w:r>
           </w:p>
         </w:tc>
@@ -6956,22 +7067,22 @@
                 <w:rFonts w:ascii="Liberation Sans" w:hAnsi="Liberation Sans"/>
                 <w:sz w:val="17"/>
               </w:rPr>
-              <w:t>Добавить в техническую статью об алюминиевом остеклении практическую модель вентиляции, микропроветривания, клапанов и конденсата.</w:t>
-            </w:r>
-          </w:p>
-        </w:tc>
-        <w:tc>
-          <w:tcPr>
-            <w:tcW w:type="dxa" w:w="3400"/>
-            <w:vAlign w:val="center"/>
-          </w:tcPr>
-          <w:p>
-            <w:r>
-              <w:rPr>
-                <w:rFonts w:ascii="Liberation Sans" w:hAnsi="Liberation Sans"/>
-                <w:sz w:val="17"/>
-              </w:rPr>
-              <w:t>Готово к внедрению на сайте.</w:t>
+              <w:t>В техническую статью об алюминиевом остеклении нужно добавить практический блок о вентиляции, микропроветривании, клапанах и конденсате.</w:t>
+            </w:r>
+          </w:p>
+        </w:tc>
+        <w:tc>
+          <w:tcPr>
+            <w:tcW w:type="dxa" w:w="3400"/>
+            <w:vAlign w:val="center"/>
+          </w:tcPr>
+          <w:p>
+            <w:r>
+              <w:rPr>
+                <w:rFonts w:ascii="Liberation Sans" w:hAnsi="Liberation Sans"/>
+                <w:sz w:val="17"/>
+              </w:rPr>
+              <w:t>Готово к доработке.</w:t>
             </w:r>
           </w:p>
         </w:tc>
@@ -7006,22 +7117,22 @@
                 <w:rFonts w:ascii="Liberation Sans" w:hAnsi="Liberation Sans"/>
                 <w:sz w:val="17"/>
               </w:rPr>
-              <w:t>Не создавать отдельный блок с повторным базовым определением французского окна; остаточную терминологию включить в уже готовую работу по французским окнам.</w:t>
-            </w:r>
-          </w:p>
-        </w:tc>
-        <w:tc>
-          <w:tcPr>
-            <w:tcW w:type="dxa" w:w="3400"/>
-            <w:vAlign w:val="center"/>
-          </w:tcPr>
-          <w:p>
-            <w:r>
-              <w:rPr>
-                <w:rFonts w:ascii="Liberation Sans" w:hAnsi="Liberation Sans"/>
-                <w:sz w:val="17"/>
-              </w:rPr>
-              <w:t>Отдельное изменение не требуется.</w:t>
+              <w:t>Базовое определение французского окна уже достаточно раскрыто; доработка должна сосредоточиться на сравнении конфигураций.</w:t>
+            </w:r>
+          </w:p>
+        </w:tc>
+        <w:tc>
+          <w:tcPr>
+            <w:tcW w:type="dxa" w:w="3400"/>
+            <w:vAlign w:val="center"/>
+          </w:tcPr>
+          <w:p>
+            <w:r>
+              <w:rPr>
+                <w:rFonts w:ascii="Liberation Sans" w:hAnsi="Liberation Sans"/>
+                <w:sz w:val="17"/>
+              </w:rPr>
+              <w:t>Текущий материал уже закрывает эту часть задачи.</w:t>
             </w:r>
           </w:p>
         </w:tc>
@@ -7056,22 +7167,22 @@
                 <w:rFonts w:ascii="Liberation Sans" w:hAnsi="Liberation Sans"/>
                 <w:sz w:val="17"/>
               </w:rPr>
-              <w:t>Добавить на страницу пластиковых дверей ориентиры по ширине, высоте, типовому и индивидуальному блоку и критериям выбора.</w:t>
-            </w:r>
-          </w:p>
-        </w:tc>
-        <w:tc>
-          <w:tcPr>
-            <w:tcW w:type="dxa" w:w="3400"/>
-            <w:vAlign w:val="center"/>
-          </w:tcPr>
-          <w:p>
-            <w:r>
-              <w:rPr>
-                <w:rFonts w:ascii="Liberation Sans" w:hAnsi="Liberation Sans"/>
-                <w:sz w:val="17"/>
-              </w:rPr>
-              <w:t>Готово к внедрению на сайте.</w:t>
+              <w:t>На странице пластиковых дверей нужно объяснить размеры, типовой и индивидуальный блок, порог, направление открывания и роль замера.</w:t>
+            </w:r>
+          </w:p>
+        </w:tc>
+        <w:tc>
+          <w:tcPr>
+            <w:tcW w:type="dxa" w:w="3400"/>
+            <w:vAlign w:val="center"/>
+          </w:tcPr>
+          <w:p>
+            <w:r>
+              <w:rPr>
+                <w:rFonts w:ascii="Liberation Sans" w:hAnsi="Liberation Sans"/>
+                <w:sz w:val="17"/>
+              </w:rPr>
+              <w:t>Готово к доработке.</w:t>
             </w:r>
           </w:p>
         </w:tc>
@@ -7106,22 +7217,22 @@
                 <w:rFonts w:ascii="Liberation Sans" w:hAnsi="Liberation Sans"/>
                 <w:sz w:val="17"/>
               </w:rPr>
-              <w:t>Сделать портфолио навигируемым по подтверждённым типам работ: балконы, веранды, панорамные и французские решения, материал и режим использования.</w:t>
-            </w:r>
-          </w:p>
-        </w:tc>
-        <w:tc>
-          <w:tcPr>
-            <w:tcW w:type="dxa" w:w="3400"/>
-            <w:vAlign w:val="center"/>
-          </w:tcPr>
-          <w:p>
-            <w:r>
-              <w:rPr>
-                <w:rFonts w:ascii="Liberation Sans" w:hAnsi="Liberation Sans"/>
-                <w:sz w:val="17"/>
-              </w:rPr>
-              <w:t>Готово к внедрению на сайте.</w:t>
+              <w:t>Портфолио нужно сделать навигируемым по реально представленным типам работ.</w:t>
+            </w:r>
+          </w:p>
+        </w:tc>
+        <w:tc>
+          <w:tcPr>
+            <w:tcW w:type="dxa" w:w="3400"/>
+            <w:vAlign w:val="center"/>
+          </w:tcPr>
+          <w:p>
+            <w:r>
+              <w:rPr>
+                <w:rFonts w:ascii="Liberation Sans" w:hAnsi="Liberation Sans"/>
+                <w:sz w:val="17"/>
+              </w:rPr>
+              <w:t>Готово к доработке.</w:t>
             </w:r>
           </w:p>
         </w:tc>
@@ -7156,22 +7267,22 @@
                 <w:rFonts w:ascii="Liberation Sans" w:hAnsi="Liberation Sans"/>
                 <w:sz w:val="17"/>
               </w:rPr>
-              <w:t>Усилить раздел алюминиевых окон блоком о панорамном формате, тёплом и холодном сценарии и проектных ограничениях; новую страницу не создавать.</w:t>
-            </w:r>
-          </w:p>
-        </w:tc>
-        <w:tc>
-          <w:tcPr>
-            <w:tcW w:type="dxa" w:w="3400"/>
-            <w:vAlign w:val="center"/>
-          </w:tcPr>
-          <w:p>
-            <w:r>
-              <w:rPr>
-                <w:rFonts w:ascii="Liberation Sans" w:hAnsi="Liberation Sans"/>
-                <w:sz w:val="17"/>
-              </w:rPr>
-              <w:t>Готово к внедрению на сайте.</w:t>
+              <w:t>Раздел алюминиевых окон нужно усилить блоком о панорамном формате, тёплом и холодном сценариях и проектных ограничениях.</w:t>
+            </w:r>
+          </w:p>
+        </w:tc>
+        <w:tc>
+          <w:tcPr>
+            <w:tcW w:type="dxa" w:w="3400"/>
+            <w:vAlign w:val="center"/>
+          </w:tcPr>
+          <w:p>
+            <w:r>
+              <w:rPr>
+                <w:rFonts w:ascii="Liberation Sans" w:hAnsi="Liberation Sans"/>
+                <w:sz w:val="17"/>
+              </w:rPr>
+              <w:t>Готово к доработке.</w:t>
             </w:r>
           </w:p>
         </w:tc>
@@ -7206,22 +7317,22 @@
                 <w:rFonts w:ascii="Liberation Sans" w:hAnsi="Liberation Sans"/>
                 <w:sz w:val="17"/>
               </w:rPr>
-              <w:t>Обновить дату и методику рейтинга лучших окон, раскрыть критерии и различие бренда и модели; архитектуру страниц не менять.</w:t>
-            </w:r>
-          </w:p>
-        </w:tc>
-        <w:tc>
-          <w:tcPr>
-            <w:tcW w:type="dxa" w:w="3400"/>
-            <w:vAlign w:val="center"/>
-          </w:tcPr>
-          <w:p>
-            <w:r>
-              <w:rPr>
-                <w:rFonts w:ascii="Liberation Sans" w:hAnsi="Liberation Sans"/>
-                <w:sz w:val="17"/>
-              </w:rPr>
-              <w:t>Готово к внедрению на сайте.</w:t>
+              <w:t>Статью о лучших окнах нужно обновить по дате, критериям и методике сравнения брендов и моделей.</w:t>
+            </w:r>
+          </w:p>
+        </w:tc>
+        <w:tc>
+          <w:tcPr>
+            <w:tcW w:type="dxa" w:w="3400"/>
+            <w:vAlign w:val="center"/>
+          </w:tcPr>
+          <w:p>
+            <w:r>
+              <w:rPr>
+                <w:rFonts w:ascii="Liberation Sans" w:hAnsi="Liberation Sans"/>
+                <w:sz w:val="17"/>
+              </w:rPr>
+              <w:t>Готово к доработке.</w:t>
             </w:r>
           </w:p>
         </w:tc>
@@ -7256,22 +7367,22 @@
                 <w:rFonts w:ascii="Liberation Sans" w:hAnsi="Liberation Sans"/>
                 <w:sz w:val="17"/>
               </w:rPr>
-              <w:t>Сохранить пятнадцать аналитически принятых связей между страницами, но не внедрять ссылки, пока не доказаны точное место и контекст каждой ссылки.</w:t>
-            </w:r>
-          </w:p>
-        </w:tc>
-        <w:tc>
-          <w:tcPr>
-            <w:tcW w:type="dxa" w:w="3400"/>
-            <w:vAlign w:val="center"/>
-          </w:tcPr>
-          <w:p>
-            <w:r>
-              <w:rPr>
-                <w:rFonts w:ascii="Liberation Sans" w:hAnsi="Liberation Sans"/>
-                <w:sz w:val="17"/>
-              </w:rPr>
-              <w:t>Связь обоснована, но место ссылки не доказано; пока не внедрять.</w:t>
+              <w:t>Для пятнадцати потенциальных внутренних ссылок следующий шаг — выбрать точное место на странице и естественный текст ссылки.</w:t>
+            </w:r>
+          </w:p>
+        </w:tc>
+        <w:tc>
+          <w:tcPr>
+            <w:tcW w:type="dxa" w:w="3400"/>
+            <w:vAlign w:val="center"/>
+          </w:tcPr>
+          <w:p>
+            <w:r>
+              <w:rPr>
+                <w:rFonts w:ascii="Liberation Sans" w:hAnsi="Liberation Sans"/>
+                <w:sz w:val="17"/>
+              </w:rPr>
+              <w:t>Следующий шаг — определить место и естественный текст каждой ссылки.</w:t>
             </w:r>
           </w:p>
         </w:tc>
@@ -7306,22 +7417,22 @@
                 <w:rFonts w:ascii="Liberation Sans" w:hAnsi="Liberation Sans"/>
                 <w:sz w:val="17"/>
               </w:rPr>
-              <w:t>Сохранить сорок шесть назначений подзадач на существующие страницы в семантической карте и плане содержания; это не означает изменение сайта.</w:t>
-            </w:r>
-          </w:p>
-        </w:tc>
-        <w:tc>
-          <w:tcPr>
-            <w:tcW w:type="dxa" w:w="3400"/>
-            <w:vAlign w:val="center"/>
-          </w:tcPr>
-          <w:p>
-            <w:r>
-              <w:rPr>
-                <w:rFonts w:ascii="Liberation Sans" w:hAnsi="Liberation Sans"/>
-                <w:sz w:val="17"/>
-              </w:rPr>
-              <w:t>Только аналитическое назначение; физически сайт по этой строке не менять.</w:t>
+              <w:t>Сорок шесть групп подзадач уже распределены по существующим страницам и могут использоваться как карта содержания.</w:t>
+            </w:r>
+          </w:p>
+        </w:tc>
+        <w:tc>
+          <w:tcPr>
+            <w:tcW w:type="dxa" w:w="3400"/>
+            <w:vAlign w:val="center"/>
+          </w:tcPr>
+          <w:p>
+            <w:r>
+              <w:rPr>
+                <w:rFonts w:ascii="Liberation Sans" w:hAnsi="Liberation Sans"/>
+                <w:sz w:val="17"/>
+              </w:rPr>
+              <w:t>Роль существующей страницы подтверждена.</w:t>
             </w:r>
           </w:p>
         </w:tc>
@@ -7356,22 +7467,22 @@
                 <w:rFonts w:ascii="Liberation Sans" w:hAnsi="Liberation Sans"/>
                 <w:sz w:val="17"/>
               </w:rPr>
-              <w:t>Сохранить двадцать структурных единиц в ожидании доказательств и не придумывать страницы, услуги или содержание до появления названного основания.</w:t>
-            </w:r>
-          </w:p>
-        </w:tc>
-        <w:tc>
-          <w:tcPr>
-            <w:tcW w:type="dxa" w:w="3400"/>
-            <w:vAlign w:val="center"/>
-          </w:tcPr>
-          <w:p>
-            <w:r>
-              <w:rPr>
-                <w:rFonts w:ascii="Liberation Sans" w:hAnsi="Liberation Sans"/>
-                <w:sz w:val="17"/>
-              </w:rPr>
-              <w:t>Ожидание доказательств; физическое изменение запрещено.</w:t>
+              <w:t>Для двадцати дополнительных тем следующий шаг зависит от новых данных о спросе, странице, услуге или содержании.</w:t>
+            </w:r>
+          </w:p>
+        </w:tc>
+        <w:tc>
+          <w:tcPr>
+            <w:tcW w:type="dxa" w:w="3400"/>
+            <w:vAlign w:val="center"/>
+          </w:tcPr>
+          <w:p>
+            <w:r>
+              <w:rPr>
+                <w:rFonts w:ascii="Liberation Sans" w:hAnsi="Liberation Sans"/>
+                <w:sz w:val="17"/>
+              </w:rPr>
+              <w:t>Следующий шаг зависит от новых данных; текущие рекомендации не блокируются.</w:t>
             </w:r>
           </w:p>
         </w:tc>
@@ -7382,7 +7493,7 @@
         <w:pStyle w:val="Heading1"/>
       </w:pPr>
       <w:r>
-        <w:t>11. Неопределённость и условия повторного открытия</w:t>
+        <w:t>Границы применения выводов</w:t>
       </w:r>
     </w:p>
     <w:p>
@@ -7390,7 +7501,7 @@
         <w:pStyle w:val="ListBullet"/>
       </w:pPr>
       <w:r>
-        <w:t>19 фраз требуют отдельной точной проверки обычной выдачи. До неё нельзя принудительно назначать страницу только ради заполнения таблицы.</w:t>
+        <w:t>Часть редких и неоднозначных формулировок сохранена вне текущего плана до тех пор, пока не появится отдельная точная проверка или новый факт. Это не блокирует семь готовых доработок.</w:t>
       </w:r>
     </w:p>
     <w:p>
@@ -7398,7 +7509,7 @@
         <w:pStyle w:val="ListBullet"/>
       </w:pPr>
       <w:r>
-        <w:t>174 фразы отложены на дополнительный разбор. Они возвращаются в работу, когда появляется достаточное основание для однозначной классификации.</w:t>
+        <w:t>Для потенциальных внутренних ссылок следующий шаг — выбрать реальное место на странице и естественный окружающий текст; после этого каждую ссылку можно оценивать как отдельную доработку.</w:t>
       </w:r>
     </w:p>
     <w:p>
@@ -7406,7 +7517,7 @@
         <w:pStyle w:val="ListBullet"/>
       </w:pPr>
       <w:r>
-        <w:t>20 структурных единиц остаются в ожидании доказательств. Новую страницу, услугу или содержание для них нельзя придумывать.</w:t>
+        <w:t>Выводы следует пересматривать, если на сайте появится новая страница, изменится ассортимент компании, изменится состав услуги или новая точная проверка покажет иную задачу пользователя.</w:t>
       </w:r>
     </w:p>
     <w:p>
@@ -7414,107 +7525,11 @@
         <w:pStyle w:val="ListBullet"/>
       </w:pPr>
       <w:r>
-        <w:t>15 связей между страницами считаются аналитически допустимыми, но для каждой ещё нужно доказать точный блок, окружающий текст и естественный смысл ссылки.</w:t>
-      </w:r>
-    </w:p>
-    <w:p>
-      <w:pPr>
-        <w:pStyle w:val="ListBullet"/>
-      </w:pPr>
-      <w:r>
-        <w:t>Для монтажа пластиковых дверей отдельные фактические границы услуги возвращаются в работу только после подтверждения компанией.</w:t>
-      </w:r>
-    </w:p>
-    <w:p>
-      <w:pPr>
-        <w:pStyle w:val="ListBullet"/>
-      </w:pPr>
-      <w:r>
-        <w:t>Если новая проверка покажет иное намерение запроса, новую публичную страницу, изменившийся ассортимент или иной подтверждённый бизнес-факт, соответствующее решение можно переоткрыть.</w:t>
-      </w:r>
-    </w:p>
-    <w:p>
-      <w:pPr>
-        <w:pStyle w:val="Heading1"/>
-      </w:pPr>
-      <w:r>
-        <w:t>12. Приоритет действий владельца</w:t>
-      </w:r>
-    </w:p>
-    <w:p>
-      <w:pPr>
-        <w:pStyle w:val="ListBullet"/>
-      </w:pPr>
-      <w:r>
-        <w:t>Сначала внедрить семь полностью готовых изменений существующих страниц.</w:t>
-      </w:r>
-    </w:p>
-    <w:p>
-      <w:pPr>
-        <w:pStyle w:val="ListBullet"/>
-      </w:pPr>
-      <w:r>
-        <w:t>Параллельно выполнить только безопасную нейтральную часть по монтажу пластиковых дверей и запросить у компании фактический состав услуги.</w:t>
-      </w:r>
-    </w:p>
-    <w:p>
-      <w:pPr>
-        <w:pStyle w:val="ListBullet"/>
-      </w:pPr>
-      <w:r>
-        <w:t>Не создавать новые страницы по девятнадцати аналитическим назначениям.</w:t>
-      </w:r>
-    </w:p>
-    <w:p>
-      <w:pPr>
-        <w:pStyle w:val="ListBullet"/>
-      </w:pPr>
-      <w:r>
-        <w:t>Не объединять и не удалять страницы в четырёх спорных случаях до отдельной проверки.</w:t>
-      </w:r>
-    </w:p>
-    <w:p>
-      <w:pPr>
-        <w:pStyle w:val="ListBullet"/>
-      </w:pPr>
-      <w:r>
-        <w:t>Не внедрять пакет из пятнадцати внутренних ссылок без проверки места каждой ссылки.</w:t>
-      </w:r>
-    </w:p>
-    <w:p>
-      <w:pPr>
-        <w:pStyle w:val="ListBullet"/>
-      </w:pPr>
-      <w:r>
-        <w:t>Сохранить положительные результаты: существующих специализированных страниц уже достаточно для значительной части исследованного спроса.</w:t>
-      </w:r>
-    </w:p>
-    <w:p>
-      <w:pPr>
-        <w:pStyle w:val="ListBullet"/>
-      </w:pPr>
-      <w:r>
-        <w:t>Возвращаться к отложенным решениям только по явно указанному новому доказательству, а не ради формального закрытия списка.</w:t>
-      </w:r>
-    </w:p>
-    <w:p>
-      <w:pPr>
-        <w:pStyle w:val="Heading1"/>
-      </w:pPr>
-      <w:r>
-        <w:t>Итог</w:t>
-      </w:r>
-    </w:p>
-    <w:p>
-      <w:pPr>
-        <w:spacing w:after="100"/>
-      </w:pPr>
-      <w:r>
-        <w:t>Главный результат исследования — не расширение сайта любой ценой, а более точное распределение пользовательских задач по уже существующим страницам. Для текущего состояния подтверждены семь готовых изменений существующего содержания и навигации, одна частично готовая работа, четыре обязательные повторные проверки и большой слой решений, где правильное действие — ничего физически не менять. Это снижает риск дублей, разрушительных объединений и публикации неподтверждённых коммерческих обещаний.</w:t>
+        <w:t>Любое обещание о составе услуги, ассортименте, гарантии или технической возможности должно опираться на подтверждённый факт компании.</w:t>
       </w:r>
     </w:p>
     <w:sectPr>
-      <w:footerReference w:type="default" r:id="rId21"/>
+      <w:footerReference w:type="default" r:id="rId18"/>
       <w:pgSz w:w="12240" w:h="15840"/>
       <w:pgMar w:top="907" w:right="1020" w:bottom="907" w:left="1020" w:header="720" w:footer="720" w:gutter="0"/>
       <w:cols w:space="720"/>

</xml_diff>